<commit_message>
Add updates to TCC document and references
- Created a new Python script `doc_update_gaps.py` to update the TCC document by filling gaps in the "Fundamentação" and "Metodologia" sections.
- Expanded the explanation of Random Forest in section 56.
- Added a new section (2.9) discussing the MLBatLife model and Greedy strategy.
- Justified the choice of linear regression over Random Forest for estimating battery end-of-life in the methodology.
- Added several new reference documents related to battery state of health and machine learning applications.
- Created backup of the original TCC document before modifications.
</commit_message>
<xml_diff>
--- a/doc/TCC_Modelo_Estrutural_Formatado_v6.docx
+++ b/doc/TCC_Modelo_Estrutural_Formatado_v6.docx
@@ -46,15 +46,7 @@
           <w:i/>
           <w:color w:val="000000"/>
         </w:rPr>
-        <w:t xml:space="preserve"> USING </w:t>
-      </w:r>
-      <w:r>
-        <w:rPr>
-          <w:b/>
-          <w:i/>
-          <w:color w:val="000000"/>
-        </w:rPr>
-        <w:t>PREDICTIVE MODEL</w:t>
+        <w:t xml:space="preserve"> USING PREDICTIVE MODEL</w:t>
       </w:r>
     </w:p>
     <w:p>
@@ -273,21 +265,43 @@
         <w:rPr>
           <w:lang w:val="pt-BR"/>
         </w:rPr>
-        <w:t xml:space="preserve">Este artigo propõe o uso de um modelo preditivo baseado em aprendizado de máquina para estimar o estado de saúde (SOH) e o fim da vida útil (EOL) de baterias aplicadas a sistemas fotovoltaicos. A partir de perfis de potência residual (demanda menos geração) em arquivos CSV e de um modelo Random Forest </w:t>
-      </w:r>
-      <w:proofErr w:type="spellStart"/>
-      <w:r>
-        <w:rPr>
-          <w:lang w:val="pt-BR"/>
-        </w:rPr>
-        <w:t>pré</w:t>
-      </w:r>
-      <w:proofErr w:type="spellEnd"/>
-      <w:r>
-        <w:rPr>
-          <w:lang w:val="pt-BR"/>
-        </w:rPr>
-        <w:t>-treinado na literatura, são extraídas features diárias e estimado o SOH ao longo do tempo. Com isso, definem-se limiares operacionais, métricas de regressão e classificação e a geração de gráficos para análise, visando apoiar a manutenção preditiva e reduzir falhas inesperadas. Espera-se que a abordagem, ancorada em dados operacionais e em técnicas consolidadas de aprendizado de máquina, amplie a confiabilidade e o planejamento de substituição de baterias (LUQUE et al., 2025; AITIO; HOWEY, 2021).</w:t>
+        <w:t>Este artigo propõe o uso de um modelo preditivo baseado em aprendizado de máquina para estimar o estado de saúde (SOH) e o fim da vida útil (EOL) de baterias aplicadas a sistemas fotovoltaicos. A partir de perfis de potência residual (</w:t>
+      </w:r>
+      <w:r>
+        <w:rPr>
+          <w:lang w:val="pt-BR"/>
+        </w:rPr>
+        <w:t xml:space="preserve">diferença </w:t>
+      </w:r>
+      <w:r>
+        <w:rPr>
+          <w:lang w:val="pt-BR"/>
+        </w:rPr>
+        <w:t xml:space="preserve">da </w:t>
+      </w:r>
+      <w:r>
+        <w:rPr>
+          <w:lang w:val="pt-BR"/>
+        </w:rPr>
+        <w:t xml:space="preserve">demanda </w:t>
+      </w:r>
+      <w:r>
+        <w:rPr>
+          <w:lang w:val="pt-BR"/>
+        </w:rPr>
+        <w:t xml:space="preserve">e </w:t>
+      </w:r>
+      <w:r>
+        <w:rPr>
+          <w:lang w:val="pt-BR"/>
+        </w:rPr>
+        <w:t>geração) em arquivos CSV e de um modelo Random Forest pré-treinado na literatura, são extraídas features diárias e estimado o SOH ao longo do tempo. Com isso, definem-se limiares operacionais, métricas de regressão e classificação e a geração de gráficos para análise, visando apoiar a manutenção preditiva e reduzir falhas inesperadas. Espera-se que a abordagem, ancorada em dados operacionais e em técnicas consolidadas de aprendizado de máquina, amplie a confiabilidade e o planejamento de substituição de baterias</w:t>
+      </w:r>
+      <w:r>
+        <w:rPr>
+          <w:lang w:val="pt-BR"/>
+        </w:rPr>
+        <w:t>.</w:t>
       </w:r>
     </w:p>
     <w:p>
@@ -329,7 +343,10 @@
         <w:pStyle w:val="ResumoTCC"/>
       </w:pPr>
       <w:r>
-        <w:t>This article proposes a machine learning-based predictive model to estimate battery state of health (SOH) and end of life (EOL) in photovoltaic systems. Based on residual power profiles (demand minus generation) stored in CSV files and a pre-trained Random Forest model from the literature, daily features are extracted and SOH is predicted over time. This supports threshold-based decisions, regression and classification metrics, and the generation of figures for analysis, aiming at predictive maintenance and reduced unexpected failures (LUQUE et al., 2025; AITIO; HOWEY, 2021).</w:t>
+        <w:t>This article proposes a machine learning-based predictive model to estimate battery state of health (SOH) and end of life (EOL) in photovoltaic systems. Based on residual power profiles (demand minus generation) stored in CSV files and a pre-trained Random Forest model from the literature, daily features are extracted and SOH is predicted over time. This supports threshold-based decisions, regression and classification metrics, and the generation of figures for analysis, aiming at predictive maintenance and reduced unexpected failures</w:t>
+      </w:r>
+      <w:r>
+        <w:t>.</w:t>
       </w:r>
     </w:p>
     <w:p>
@@ -352,39 +369,7 @@
           <w:color w:val="000000"/>
           <w:lang w:val="pt-BR"/>
         </w:rPr>
-        <w:t xml:space="preserve">Machine learning. </w:t>
-      </w:r>
-      <w:proofErr w:type="spellStart"/>
-      <w:r>
-        <w:rPr>
-          <w:color w:val="000000"/>
-          <w:lang w:val="pt-BR"/>
-        </w:rPr>
-        <w:t>State</w:t>
-      </w:r>
-      <w:proofErr w:type="spellEnd"/>
-      <w:r>
-        <w:rPr>
-          <w:color w:val="000000"/>
-          <w:lang w:val="pt-BR"/>
-        </w:rPr>
-        <w:t xml:space="preserve"> </w:t>
-      </w:r>
-      <w:proofErr w:type="spellStart"/>
-      <w:r>
-        <w:rPr>
-          <w:color w:val="000000"/>
-          <w:lang w:val="pt-BR"/>
-        </w:rPr>
-        <w:t>of</w:t>
-      </w:r>
-      <w:proofErr w:type="spellEnd"/>
-      <w:r>
-        <w:rPr>
-          <w:color w:val="000000"/>
-          <w:lang w:val="pt-BR"/>
-        </w:rPr>
-        <w:t xml:space="preserve"> Health.</w:t>
+        <w:t>Machine learning. State of Health.</w:t>
       </w:r>
     </w:p>
     <w:p>
@@ -469,47 +454,15 @@
           <w:color w:val="000000"/>
           <w:lang w:val="pt-BR"/>
         </w:rPr>
-        <w:t xml:space="preserve">O objetivo geral deste trabalho é aplicar o modelo preditivo </w:t>
-      </w:r>
-      <w:proofErr w:type="spellStart"/>
+        <w:t xml:space="preserve">O objetivo geral deste trabalho é aplicar o modelo preditivo MLBatLife para estimar o estado de saúde (SOH) de baterias em sistemas fotovoltaicos residenciais, comparando perfis de consumo de diferentes contextos geográficos. Para alcançar </w:t>
+      </w:r>
       <w:r>
         <w:rPr>
           <w:color w:val="000000"/>
           <w:lang w:val="pt-BR"/>
         </w:rPr>
-        <w:t>MLBatLife</w:t>
-      </w:r>
-      <w:proofErr w:type="spellEnd"/>
-      <w:r>
-        <w:rPr>
-          <w:color w:val="000000"/>
-          <w:lang w:val="pt-BR"/>
-        </w:rPr>
-        <w:t xml:space="preserve"> para estimar o estado de saúde (SOH) de baterias em sistemas fotovoltaicos residenciais, comparando perfis de consumo de diferentes contextos geográficos. Para alcançar </w:t>
-      </w:r>
-      <w:r>
-        <w:rPr>
-          <w:color w:val="000000"/>
-          <w:lang w:val="pt-BR"/>
-        </w:rPr>
         <w:lastRenderedPageBreak/>
-        <w:t xml:space="preserve">esse propósito, foram construídos perfis de potência residual a partir de dados reais do projeto Open Power System Data (Alemanha) e de um perfil sintético representativo do consumo residencial brasileiro, com geração fotovoltaica estimada pela base PVGIS do Joint </w:t>
-      </w:r>
-      <w:proofErr w:type="spellStart"/>
-      <w:r>
-        <w:rPr>
-          <w:color w:val="000000"/>
-          <w:lang w:val="pt-BR"/>
-        </w:rPr>
-        <w:t>Research</w:t>
-      </w:r>
-      <w:proofErr w:type="spellEnd"/>
-      <w:r>
-        <w:rPr>
-          <w:color w:val="000000"/>
-          <w:lang w:val="pt-BR"/>
-        </w:rPr>
-        <w:t xml:space="preserve"> Centre da Comissão Europeia. A partir desses perfis, o modelo estima o SOH diário da bateria, permitindo avaliar como diferentes padrões de consumo e geração influenciam a degradação ao longo do tempo (LUQUE et al., 2025; AITIO; HOWEY, 2021).</w:t>
+        <w:t>esse propósito, foram construídos perfis de potência residual a partir de dados reais do projeto Open Power System Data (Alemanha) e de um perfil sintético representativo do consumo residencial brasileiro, com geração fotovoltaica estimada pela base PVGIS do Joint Research Centre da Comissão Europeia. A partir desses perfis, o modelo estima o SOH diário da bateria, permitindo avaliar como diferentes padrões de consumo e geração influenciam a degradação ao longo do tempo (LUQUE et al., 2025; AITIO; HOWEY, 2021).</w:t>
       </w:r>
     </w:p>
     <w:p>
@@ -580,21 +533,12 @@
           <w:lang w:val="pt-BR"/>
         </w:rPr>
       </w:pPr>
-      <w:proofErr w:type="spellStart"/>
       <w:r>
         <w:rPr>
           <w:rFonts w:ascii="Arial" w:hAnsi="Arial" w:cs="Arial"/>
           <w:lang w:val="pt-BR"/>
         </w:rPr>
-        <w:t>Curtailment</w:t>
-      </w:r>
-      <w:proofErr w:type="spellEnd"/>
-      <w:r>
-        <w:rPr>
-          <w:rFonts w:ascii="Arial" w:hAnsi="Arial" w:cs="Arial"/>
-          <w:lang w:val="pt-BR"/>
-        </w:rPr>
-        <w:t xml:space="preserve"> e motivação para o armazenamento de energia</w:t>
+        <w:t>Curtailment e motivação para o armazenamento de energia</w:t>
       </w:r>
     </w:p>
     <w:p>
@@ -609,39 +553,7 @@
           <w:color w:val="000000"/>
           <w:lang w:val="pt-BR"/>
         </w:rPr>
-        <w:t xml:space="preserve">O crescimento acelerado da geração solar fotovoltaica no Brasil tem evidenciado limitações na capacidade de absorção da rede elétrica, resultando em eventos de </w:t>
-      </w:r>
-      <w:proofErr w:type="spellStart"/>
-      <w:r>
-        <w:rPr>
-          <w:color w:val="000000"/>
-          <w:lang w:val="pt-BR"/>
-        </w:rPr>
-        <w:t>curtailment</w:t>
-      </w:r>
-      <w:proofErr w:type="spellEnd"/>
-      <w:r>
-        <w:rPr>
-          <w:color w:val="000000"/>
-          <w:lang w:val="pt-BR"/>
-        </w:rPr>
-        <w:t xml:space="preserve">, nos quais a geração disponível é reduzida ou interrompida mesmo com recurso solar suficiente. No contexto do Sistema Interligado Nacional (SIN), o Operador Nacional do Sistema Elétrico (ONS) pode determinar o </w:t>
-      </w:r>
-      <w:proofErr w:type="spellStart"/>
-      <w:r>
-        <w:rPr>
-          <w:color w:val="000000"/>
-          <w:lang w:val="pt-BR"/>
-        </w:rPr>
-        <w:t>constrained</w:t>
-      </w:r>
-      <w:proofErr w:type="spellEnd"/>
-      <w:r>
-        <w:rPr>
-          <w:color w:val="000000"/>
-          <w:lang w:val="pt-BR"/>
-        </w:rPr>
-        <w:t>-off de usinas por razões de segurança operativa, sobrecarga na transmissão ou controle de tensão, conforme regulamentação da Agência Nacional de Energia Elétrica (</w:t>
+        <w:t>O crescimento acelerado da geração solar fotovoltaica no Brasil tem evidenciado limitações na capacidade de absorção da rede elétrica, resultando em eventos de curtailment, nos quais a geração disponível é reduzida ou interrompida mesmo com recurso solar suficiente. No contexto do Sistema Interligado Nacional (SIN), o Operador Nacional do Sistema Elétrico (ONS) pode determinar o constrained-off de usinas por razões de segurança operativa, sobrecarga na transmissão ou controle de tensão, conforme regulamentação da Agência Nacional de Energia Elétrica (</w:t>
       </w:r>
       <w:r>
         <w:rPr>
@@ -668,21 +580,7 @@
           <w:lang w:val="pt-BR"/>
         </w:rPr>
         <w:lastRenderedPageBreak/>
-        <w:t xml:space="preserve">Em sistemas residenciais, embora o </w:t>
-      </w:r>
-      <w:proofErr w:type="spellStart"/>
-      <w:r>
-        <w:rPr>
-          <w:lang w:val="pt-BR"/>
-        </w:rPr>
-        <w:t>constrained</w:t>
-      </w:r>
-      <w:proofErr w:type="spellEnd"/>
-      <w:r>
-        <w:rPr>
-          <w:lang w:val="pt-BR"/>
-        </w:rPr>
-        <w:t>-off regulatório não se aplique diretamente, a mesma dinâmica ocorre quando a geração fotovoltaica excede o consumo instantâneo da residência. Nesses períodos, o excedente é exportado para a rede por meio de compensação de créditos, porém, com a tendência de redução das tarifas de compensação e o aumento da penetração fotovoltaica, o armazenamento local por baterias torna-se uma alternativa relevante para maximizar o autoconsumo e a viabilidade econômica do sistema (SILVA, 2018; LUQUE et al., 2025).</w:t>
+        <w:t>Em sistemas residenciais, embora o constrained-off regulatório não se aplique diretamente, a mesma dinâmica ocorre quando a geração fotovoltaica excede o consumo instantâneo da residência. Nesses períodos, o excedente é exportado para a rede por meio de compensação de créditos, porém, com a tendência de redução das tarifas de compensação e o aumento da penetração fotovoltaica, o armazenamento local por baterias torna-se uma alternativa relevante para maximizar o autoconsumo e a viabilidade econômica do sistema (SILVA, 2018; LUQUE et al., 2025).</w:t>
       </w:r>
     </w:p>
     <w:p>
@@ -695,13 +593,7 @@
         <w:rPr>
           <w:lang w:val="pt-BR"/>
         </w:rPr>
-        <w:t>Nesse contexto, a bateria assume o papel de deslocar temporalmente a energia excedente gerada durante o dia para os horários de maior demanda, como o período noturno. Essa estratégia reduz a dependência da rede e aumenta a fração de autoconsumo, mas impõe ciclos adicionais de carga e descarga à bateria, acelerando sua degradação. Portanto, compreender o impacto do perfil de consumo e geração na saúde da bateria é fundamental para dimensionar adequadamente o sistema de armazenamento e planejar sua substituiç</w:t>
-      </w:r>
-      <w:r>
-        <w:rPr>
-          <w:lang w:val="pt-BR"/>
-        </w:rPr>
-        <w:t>ão (AITIO; HOWEY, 2021; LUQUE et al., 2025).</w:t>
+        <w:t>Nesse contexto, a bateria assume o papel de deslocar temporalmente a energia excedente gerada durante o dia para os horários de maior demanda, como o período noturno. Essa estratégia reduz a dependência da rede e aumenta a fração de autoconsumo, mas impõe ciclos adicionais de carga e descarga à bateria, acelerando sua degradação. Portanto, compreender o impacto do perfil de consumo e geração na saúde da bateria é fundamental para dimensionar adequadamente o sistema de armazenamento e planejar sua substituição (AITIO; HOWEY, 2021; LUQUE et al., 2025).</w:t>
       </w:r>
     </w:p>
     <w:p>
@@ -761,9 +653,9 @@
           <w:lang w:val="pt-BR"/>
         </w:rPr>
         <w:drawing>
-          <wp:inline distT="0" distB="0" distL="0" distR="0" wp14:anchorId="6D108362" wp14:editId="577B31C1">
-            <wp:extent cx="2734285" cy="2676063"/>
-            <wp:effectExtent l="0" t="0" r="9525" b="0"/>
+          <wp:inline distT="0" distB="0" distL="0" distR="0" wp14:anchorId="6D108362" wp14:editId="59507AAE">
+            <wp:extent cx="3061335" cy="2675466"/>
+            <wp:effectExtent l="0" t="0" r="5715" b="0"/>
             <wp:docPr id="1123154399" name="Imagem 3"/>
             <wp:cNvGraphicFramePr>
               <a:graphicFrameLocks xmlns:a="http://schemas.openxmlformats.org/drawingml/2006/main" noChangeAspect="1"/>
@@ -793,7 +685,7 @@
                   <pic:spPr bwMode="auto">
                     <a:xfrm>
                       <a:off x="0" y="0"/>
-                      <a:ext cx="2752110" cy="2693508"/>
+                      <a:ext cx="3084655" cy="2695847"/>
                     </a:xfrm>
                     <a:prstGeom prst="rect">
                       <a:avLst/>
@@ -956,149 +848,22 @@
           <w:color w:val="000000"/>
           <w:lang w:val="pt-BR"/>
         </w:rPr>
-        <w:t xml:space="preserve">O </w:t>
-      </w:r>
-      <w:proofErr w:type="spellStart"/>
-      <w:r>
-        <w:rPr>
-          <w:color w:val="000000"/>
-          <w:lang w:val="pt-BR"/>
-        </w:rPr>
-        <w:t>State</w:t>
-      </w:r>
-      <w:proofErr w:type="spellEnd"/>
-      <w:r>
-        <w:rPr>
-          <w:color w:val="000000"/>
-          <w:lang w:val="pt-BR"/>
-        </w:rPr>
-        <w:t xml:space="preserve"> </w:t>
-      </w:r>
-      <w:proofErr w:type="spellStart"/>
-      <w:r>
-        <w:rPr>
-          <w:color w:val="000000"/>
-          <w:lang w:val="pt-BR"/>
-        </w:rPr>
-        <w:t>of</w:t>
-      </w:r>
-      <w:proofErr w:type="spellEnd"/>
-      <w:r>
-        <w:rPr>
-          <w:color w:val="000000"/>
-          <w:lang w:val="pt-BR"/>
-        </w:rPr>
-        <w:t xml:space="preserve"> Charge (SOC) representa o estado de carga da bateria em determinado instante, indicando a fração de energia ainda disponível em relação à sua capacidade nominal ou estimada. Esse indicador é fundamental para o controle operacional do sistema, pois auxilia na definição dos limites de carga e descarga e evita condições de operação que possam acelerar a degradação (SILVA, 2018).</w:t>
+        <w:t>O State of Charge (SOC) representa o estado de carga da bateria em determinado instante, indicando a fração de energia ainda disponível em relação à sua capacidade nominal ou estimada. Esse indicador é fundamental para o controle operacional do sistema, pois auxilia na definição dos limites de carga e descarga e evita condições de operação que possam acelerar a degradação (SILVA, 2018).</w:t>
       </w:r>
     </w:p>
     <w:p>
       <w:pPr>
         <w:rPr>
-          <w:lang w:val="pt-BR"/>
-        </w:rPr>
-      </w:pPr>
-      <w:r>
-        <w:rPr>
           <w:color w:val="000000"/>
           <w:lang w:val="pt-BR"/>
         </w:rPr>
-        <w:t xml:space="preserve">O </w:t>
-      </w:r>
-      <w:proofErr w:type="spellStart"/>
+      </w:pPr>
       <w:r>
         <w:rPr>
           <w:color w:val="000000"/>
           <w:lang w:val="pt-BR"/>
         </w:rPr>
-        <w:t>State</w:t>
-      </w:r>
-      <w:proofErr w:type="spellEnd"/>
-      <w:r>
-        <w:rPr>
-          <w:color w:val="000000"/>
-          <w:lang w:val="pt-BR"/>
-        </w:rPr>
-        <w:t xml:space="preserve"> </w:t>
-      </w:r>
-      <w:proofErr w:type="spellStart"/>
-      <w:r>
-        <w:rPr>
-          <w:color w:val="000000"/>
-          <w:lang w:val="pt-BR"/>
-        </w:rPr>
-        <w:t>of</w:t>
-      </w:r>
-      <w:proofErr w:type="spellEnd"/>
-      <w:r>
-        <w:rPr>
-          <w:color w:val="000000"/>
-          <w:lang w:val="pt-BR"/>
-        </w:rPr>
-        <w:t xml:space="preserve"> Health (SOH) representa o estado de saúde da bateria e costuma ser associado à capacidade remanescente ou ao aumento da resistência interna em relação à condição inicial. Já o </w:t>
-      </w:r>
-      <w:proofErr w:type="spellStart"/>
-      <w:r>
-        <w:rPr>
-          <w:color w:val="000000"/>
-          <w:lang w:val="pt-BR"/>
-        </w:rPr>
-        <w:t>Remaining</w:t>
-      </w:r>
-      <w:proofErr w:type="spellEnd"/>
-      <w:r>
-        <w:rPr>
-          <w:color w:val="000000"/>
-          <w:lang w:val="pt-BR"/>
-        </w:rPr>
-        <w:t xml:space="preserve"> </w:t>
-      </w:r>
-      <w:proofErr w:type="spellStart"/>
-      <w:r>
-        <w:rPr>
-          <w:color w:val="000000"/>
-          <w:lang w:val="pt-BR"/>
-        </w:rPr>
-        <w:t>Useful</w:t>
-      </w:r>
-      <w:proofErr w:type="spellEnd"/>
-      <w:r>
-        <w:rPr>
-          <w:color w:val="000000"/>
-          <w:lang w:val="pt-BR"/>
-        </w:rPr>
-        <w:t xml:space="preserve"> Life (RUL) indica a vida útil remanescente até que a bateria atinja o </w:t>
-      </w:r>
-      <w:proofErr w:type="spellStart"/>
-      <w:r>
-        <w:rPr>
-          <w:color w:val="000000"/>
-          <w:lang w:val="pt-BR"/>
-        </w:rPr>
-        <w:t>End</w:t>
-      </w:r>
-      <w:proofErr w:type="spellEnd"/>
-      <w:r>
-        <w:rPr>
-          <w:color w:val="000000"/>
-          <w:lang w:val="pt-BR"/>
-        </w:rPr>
-        <w:t xml:space="preserve"> </w:t>
-      </w:r>
-      <w:proofErr w:type="spellStart"/>
-      <w:r>
-        <w:rPr>
-          <w:color w:val="000000"/>
-          <w:lang w:val="pt-BR"/>
-        </w:rPr>
-        <w:t>of</w:t>
-      </w:r>
-      <w:proofErr w:type="spellEnd"/>
-      <w:r>
-        <w:rPr>
-          <w:color w:val="000000"/>
-          <w:lang w:val="pt-BR"/>
-        </w:rPr>
-        <w:t xml:space="preserve"> Life (EOL), normalmente definido por </w:t>
+        <w:t xml:space="preserve">O State of Health (SOH) representa o estado de saúde da bateria e costuma ser associado à capacidade remanescente ou ao aumento da resistência interna em relação à condição inicial. Já o Remaining Useful Life (RUL) indica a vida útil remanescente até que a bateria atinja o End of Life (EOL), normalmente definido por </w:t>
       </w:r>
       <w:r>
         <w:rPr>
@@ -1111,6 +876,132 @@
     </w:p>
     <w:p>
       <w:pPr>
+        <w:pStyle w:val="TtulodeFiguras"/>
+        <w:spacing w:line="360" w:lineRule="auto"/>
+      </w:pPr>
+      <w:r>
+        <w:t xml:space="preserve">Figura 1 </w:t>
+      </w:r>
+      <w:r>
+        <w:t>–</w:t>
+      </w:r>
+      <w:r>
+        <w:t xml:space="preserve"> </w:t>
+      </w:r>
+      <w:r>
+        <w:t>Exemplo de m</w:t>
+      </w:r>
+      <w:r>
+        <w:t xml:space="preserve">edição de saúde de bateria de celular </w:t>
+      </w:r>
+      <w:r>
+        <w:t xml:space="preserve">por aplicativo </w:t>
+      </w:r>
+      <w:r>
+        <w:t>(</w:t>
+      </w:r>
+      <w:r>
+        <w:rPr>
+          <w:i/>
+          <w:iCs/>
+        </w:rPr>
+        <w:t>AccuBattery</w:t>
+      </w:r>
+      <w:r>
+        <w:t>)</w:t>
+      </w:r>
+    </w:p>
+    <w:p>
+      <w:pPr>
+        <w:spacing w:line="240" w:lineRule="auto"/>
+        <w:ind w:firstLine="0"/>
+        <w:jc w:val="center"/>
+        <w:rPr>
+          <w:lang w:val="pt-BR"/>
+        </w:rPr>
+      </w:pPr>
+      <w:r>
+        <w:rPr>
+          <w:noProof/>
+          <w:lang w:val="pt-BR"/>
+        </w:rPr>
+        <w:drawing>
+          <wp:inline distT="0" distB="0" distL="0" distR="0" wp14:anchorId="09775FC6" wp14:editId="10670176">
+            <wp:extent cx="3199311" cy="3937000"/>
+            <wp:effectExtent l="0" t="0" r="1270" b="6350"/>
+            <wp:docPr id="1151301618" name="Imagem 3"/>
+            <wp:cNvGraphicFramePr>
+              <a:graphicFrameLocks xmlns:a="http://schemas.openxmlformats.org/drawingml/2006/main" noChangeAspect="1"/>
+            </wp:cNvGraphicFramePr>
+            <a:graphic xmlns:a="http://schemas.openxmlformats.org/drawingml/2006/main">
+              <a:graphicData uri="http://schemas.openxmlformats.org/drawingml/2006/picture">
+                <pic:pic xmlns:pic="http://schemas.openxmlformats.org/drawingml/2006/picture">
+                  <pic:nvPicPr>
+                    <pic:cNvPr id="0" name="Picture 3"/>
+                    <pic:cNvPicPr>
+                      <a:picLocks noChangeAspect="1" noChangeArrowheads="1"/>
+                    </pic:cNvPicPr>
+                  </pic:nvPicPr>
+                  <pic:blipFill rotWithShape="1">
+                    <a:blip r:embed="rId9">
+                      <a:extLst>
+                        <a:ext uri="{28A0092B-C50C-407E-A947-70E740481C1C}">
+                          <a14:useLocalDpi xmlns:a14="http://schemas.microsoft.com/office/drawing/2010/main" val="0"/>
+                        </a:ext>
+                      </a:extLst>
+                    </a:blip>
+                    <a:srcRect t="19795" b="23061"/>
+                    <a:stretch>
+                      <a:fillRect/>
+                    </a:stretch>
+                  </pic:blipFill>
+                  <pic:spPr bwMode="auto">
+                    <a:xfrm>
+                      <a:off x="0" y="0"/>
+                      <a:ext cx="3217001" cy="3958769"/>
+                    </a:xfrm>
+                    <a:prstGeom prst="rect">
+                      <a:avLst/>
+                    </a:prstGeom>
+                    <a:noFill/>
+                    <a:ln>
+                      <a:noFill/>
+                    </a:ln>
+                    <a:extLst>
+                      <a:ext uri="{53640926-AAD7-44D8-BBD7-CCE9431645EC}">
+                        <a14:shadowObscured xmlns:a14="http://schemas.microsoft.com/office/drawing/2010/main"/>
+                      </a:ext>
+                    </a:extLst>
+                  </pic:spPr>
+                </pic:pic>
+              </a:graphicData>
+            </a:graphic>
+          </wp:inline>
+        </w:drawing>
+      </w:r>
+      <w:r>
+        <w:rPr>
+          <w:lang w:val="pt-BR"/>
+        </w:rPr>
+        <w:br/>
+      </w:r>
+      <w:r>
+        <w:rPr>
+          <w:rStyle w:val="TtulodeFigurasChar"/>
+        </w:rPr>
+        <w:t>Fonte: Elaborado pelos autores.</w:t>
+      </w:r>
+    </w:p>
+    <w:p>
+      <w:pPr>
+        <w:jc w:val="center"/>
+        <w:rPr>
+          <w:lang w:val="pt-BR"/>
+        </w:rPr>
+      </w:pPr>
+    </w:p>
+    <w:p>
+      <w:pPr>
         <w:pStyle w:val="Ttulo2"/>
         <w:jc w:val="left"/>
         <w:rPr>
@@ -1166,6 +1057,7 @@
           <w:rFonts w:ascii="Arial" w:eastAsia="Arial" w:hAnsi="Arial"/>
           <w:lang w:val="pt-BR"/>
         </w:rPr>
+        <w:lastRenderedPageBreak/>
         <w:t>Aprendizado de máquina</w:t>
       </w:r>
     </w:p>
@@ -1261,7 +1153,6 @@
         </w:rPr>
         <w:t xml:space="preserve"> (</w:t>
       </w:r>
-      <w:proofErr w:type="spellStart"/>
       <w:r>
         <w:rPr>
           <w:color w:val="000000"/>
@@ -1276,9 +1167,8 @@
           <w:color w:val="000000"/>
           <w:lang w:val="pt-BR"/>
         </w:rPr>
-        <w:t>tate</w:t>
-      </w:r>
-      <w:proofErr w:type="spellEnd"/>
+        <w:t xml:space="preserve">tate of </w:t>
+      </w:r>
       <w:r>
         <w:rPr>
           <w:i/>
@@ -1286,9 +1176,8 @@
           <w:color w:val="000000"/>
           <w:lang w:val="pt-BR"/>
         </w:rPr>
-        <w:t xml:space="preserve"> </w:t>
-      </w:r>
-      <w:proofErr w:type="spellStart"/>
+        <w:t>h</w:t>
+      </w:r>
       <w:r>
         <w:rPr>
           <w:i/>
@@ -1296,9 +1185,29 @@
           <w:color w:val="000000"/>
           <w:lang w:val="pt-BR"/>
         </w:rPr>
-        <w:t>of</w:t>
-      </w:r>
-      <w:proofErr w:type="spellEnd"/>
+        <w:t>ealth</w:t>
+      </w:r>
+      <w:r>
+        <w:rPr>
+          <w:color w:val="000000"/>
+          <w:lang w:val="pt-BR"/>
+        </w:rPr>
+        <w:t>)</w:t>
+      </w:r>
+      <w:r>
+        <w:rPr>
+          <w:color w:val="000000"/>
+          <w:lang w:val="pt-BR"/>
+        </w:rPr>
+        <w:t xml:space="preserve"> e do </w:t>
+      </w:r>
+      <w:r>
+        <w:rPr>
+          <w:color w:val="000000"/>
+          <w:lang w:val="pt-BR"/>
+        </w:rPr>
+        <w:t>EOL (</w:t>
+      </w:r>
       <w:r>
         <w:rPr>
           <w:i/>
@@ -1306,121 +1215,21 @@
           <w:color w:val="000000"/>
           <w:lang w:val="pt-BR"/>
         </w:rPr>
-        <w:t xml:space="preserve"> </w:t>
-      </w:r>
-      <w:proofErr w:type="spellStart"/>
-      <w:r>
-        <w:rPr>
-          <w:i/>
-          <w:iCs/>
+        <w:t>end of life</w:t>
+      </w:r>
+      <w:r>
+        <w:rPr>
           <w:color w:val="000000"/>
           <w:lang w:val="pt-BR"/>
         </w:rPr>
-        <w:t>h</w:t>
-      </w:r>
-      <w:r>
-        <w:rPr>
-          <w:i/>
-          <w:iCs/>
+        <w:t>)</w:t>
+      </w:r>
+      <w:r>
+        <w:rPr>
           <w:color w:val="000000"/>
           <w:lang w:val="pt-BR"/>
         </w:rPr>
-        <w:t>ealth</w:t>
-      </w:r>
-      <w:proofErr w:type="spellEnd"/>
-      <w:r>
-        <w:rPr>
-          <w:color w:val="000000"/>
-          <w:lang w:val="pt-BR"/>
-        </w:rPr>
-        <w:t>)</w:t>
-      </w:r>
-      <w:r>
-        <w:rPr>
-          <w:color w:val="000000"/>
-          <w:lang w:val="pt-BR"/>
-        </w:rPr>
-        <w:t xml:space="preserve"> e do </w:t>
-      </w:r>
-      <w:r>
-        <w:rPr>
-          <w:color w:val="000000"/>
-          <w:lang w:val="pt-BR"/>
-        </w:rPr>
-        <w:t>EOL (</w:t>
-      </w:r>
-      <w:proofErr w:type="spellStart"/>
-      <w:r>
-        <w:rPr>
-          <w:i/>
-          <w:iCs/>
-          <w:color w:val="000000"/>
-          <w:lang w:val="pt-BR"/>
-        </w:rPr>
-        <w:t>end</w:t>
-      </w:r>
-      <w:proofErr w:type="spellEnd"/>
-      <w:r>
-        <w:rPr>
-          <w:i/>
-          <w:iCs/>
-          <w:color w:val="000000"/>
-          <w:lang w:val="pt-BR"/>
-        </w:rPr>
-        <w:t xml:space="preserve"> </w:t>
-      </w:r>
-      <w:proofErr w:type="spellStart"/>
-      <w:r>
-        <w:rPr>
-          <w:i/>
-          <w:iCs/>
-          <w:color w:val="000000"/>
-          <w:lang w:val="pt-BR"/>
-        </w:rPr>
-        <w:t>of</w:t>
-      </w:r>
-      <w:proofErr w:type="spellEnd"/>
-      <w:r>
-        <w:rPr>
-          <w:i/>
-          <w:iCs/>
-          <w:color w:val="000000"/>
-          <w:lang w:val="pt-BR"/>
-        </w:rPr>
-        <w:t xml:space="preserve"> </w:t>
-      </w:r>
-      <w:proofErr w:type="spellStart"/>
-      <w:r>
-        <w:rPr>
-          <w:i/>
-          <w:iCs/>
-          <w:color w:val="000000"/>
-          <w:lang w:val="pt-BR"/>
-        </w:rPr>
-        <w:t>life</w:t>
-      </w:r>
-      <w:proofErr w:type="spellEnd"/>
-      <w:r>
-        <w:rPr>
-          <w:color w:val="000000"/>
-          <w:lang w:val="pt-BR"/>
-        </w:rPr>
-        <w:t>)</w:t>
-      </w:r>
-      <w:r>
-        <w:rPr>
-          <w:color w:val="000000"/>
-          <w:lang w:val="pt-BR"/>
-        </w:rPr>
-        <w:t xml:space="preserve"> pode ser realizada por métodos baseados em modelo, métodos orientados a dados ou métodos híbridos. </w:t>
-      </w:r>
-      <w:r>
-        <w:rPr>
-          <w:color w:val="000000"/>
-          <w:lang w:val="pt-BR"/>
-        </w:rPr>
-        <w:lastRenderedPageBreak/>
-        <w:t>Métodos baseados em modelo dependem de conhecimento físico e eletroquímico do sistema, enquanto métodos orientados a dados utilizam registros históricos de operação para identificar relações entre variáveis medidas e indicadores de degradação (AITIO; HOWEY, 2021; LUQUE et al., 2025).</w:t>
+        <w:t xml:space="preserve"> pode ser realizada por métodos baseados em modelo, métodos orientados a dados ou métodos híbridos. Métodos baseados em modelo dependem de conhecimento físico e eletroquímico do sistema, enquanto métodos orientados a dados utilizam registros históricos de operação para identificar relações entre variáveis medidas e indicadores de degradação (AITIO; HOWEY, 2021; LUQUE et al., 2025).</w:t>
       </w:r>
     </w:p>
     <w:p>
@@ -1434,124 +1243,21 @@
           <w:color w:val="000000"/>
           <w:lang w:val="pt-BR"/>
         </w:rPr>
-        <w:t xml:space="preserve">Modelos como Random Forest, </w:t>
-      </w:r>
-      <w:proofErr w:type="spellStart"/>
+        <w:t xml:space="preserve">Diversos algoritmos de aprendizado de máquina têm sido empregados na estimativa de SOH e EOL, incluindo Random Forest, Gradient Boosting, Support Vector Regression, Gaussian Process Regression e redes neurais (RASMUSSEN; WILLIAMS, 2006; LUQUE et al., 2025). Entre esses, o Random Forest (BREIMAN, 2001) destaca-se por sua aplicação em problemas de regressão com dados tabulares. O algoritmo constrói um conjunto (ensemble) de árvores de decisão, cada uma treinada sobre uma amostra aleatória com reposição (bootstrap) dos dados originais. A predição final é obtida pela média das saídas de todas as árvores, o que reduz a variância e aumenta a robustez do modelo. Os principais hiperparâmetros são o número de estimadores (n_estimators) e a profundidade máxima de cada árvore (max_depth). Além disso, o Random Forest permite quantificar a importância de cada variável de entrada por meio da diminuição média de impureza (Mean Decrease in </w:t>
+      </w:r>
       <w:r>
         <w:rPr>
           <w:color w:val="000000"/>
           <w:lang w:val="pt-BR"/>
         </w:rPr>
-        <w:t>Gradient</w:t>
-      </w:r>
-      <w:proofErr w:type="spellEnd"/>
-      <w:r>
-        <w:rPr>
-          <w:color w:val="000000"/>
-          <w:lang w:val="pt-BR"/>
-        </w:rPr>
-        <w:t xml:space="preserve"> </w:t>
-      </w:r>
-      <w:proofErr w:type="spellStart"/>
-      <w:r>
-        <w:rPr>
-          <w:color w:val="000000"/>
-          <w:lang w:val="pt-BR"/>
-        </w:rPr>
-        <w:t>Boosting</w:t>
-      </w:r>
-      <w:proofErr w:type="spellEnd"/>
-      <w:r>
-        <w:rPr>
-          <w:color w:val="000000"/>
-          <w:lang w:val="pt-BR"/>
-        </w:rPr>
-        <w:t xml:space="preserve">, </w:t>
-      </w:r>
-      <w:proofErr w:type="spellStart"/>
-      <w:r>
-        <w:rPr>
-          <w:color w:val="000000"/>
-          <w:lang w:val="pt-BR"/>
-        </w:rPr>
-        <w:t>Support</w:t>
-      </w:r>
-      <w:proofErr w:type="spellEnd"/>
-      <w:r>
-        <w:rPr>
-          <w:color w:val="000000"/>
-          <w:lang w:val="pt-BR"/>
-        </w:rPr>
-        <w:t xml:space="preserve"> Vector </w:t>
-      </w:r>
-      <w:proofErr w:type="spellStart"/>
-      <w:r>
-        <w:rPr>
-          <w:color w:val="000000"/>
-          <w:lang w:val="pt-BR"/>
-        </w:rPr>
-        <w:t>Regression</w:t>
-      </w:r>
-      <w:proofErr w:type="spellEnd"/>
-      <w:r>
-        <w:rPr>
-          <w:color w:val="000000"/>
-          <w:lang w:val="pt-BR"/>
-        </w:rPr>
-        <w:t xml:space="preserve">, </w:t>
-      </w:r>
-      <w:proofErr w:type="spellStart"/>
-      <w:r>
-        <w:rPr>
-          <w:color w:val="000000"/>
-          <w:lang w:val="pt-BR"/>
-        </w:rPr>
-        <w:t>Gaussian</w:t>
-      </w:r>
-      <w:proofErr w:type="spellEnd"/>
-      <w:r>
-        <w:rPr>
-          <w:color w:val="000000"/>
-          <w:lang w:val="pt-BR"/>
-        </w:rPr>
-        <w:t xml:space="preserve"> </w:t>
-      </w:r>
-      <w:proofErr w:type="spellStart"/>
-      <w:r>
-        <w:rPr>
-          <w:color w:val="000000"/>
-          <w:lang w:val="pt-BR"/>
-        </w:rPr>
-        <w:t>Process</w:t>
-      </w:r>
-      <w:proofErr w:type="spellEnd"/>
-      <w:r>
-        <w:rPr>
-          <w:color w:val="000000"/>
-          <w:lang w:val="pt-BR"/>
-        </w:rPr>
-        <w:t xml:space="preserve"> </w:t>
-      </w:r>
-      <w:proofErr w:type="spellStart"/>
-      <w:r>
-        <w:rPr>
-          <w:color w:val="000000"/>
-          <w:lang w:val="pt-BR"/>
-        </w:rPr>
-        <w:t>Regression</w:t>
-      </w:r>
-      <w:proofErr w:type="spellEnd"/>
-      <w:r>
-        <w:rPr>
-          <w:color w:val="000000"/>
-          <w:lang w:val="pt-BR"/>
-        </w:rPr>
-        <w:t xml:space="preserve"> e redes neurais têm sido utilizados em estudos de previsão de saúde de baterias. Para este trabalho, a escolha inicial por modelos supervisionados de regressão e classificação permite equilibrar desempenho, simplicidade de implementação, geração de métricas e interpretação dos fatores que mais influenciam a degradação (BREIMAN, 2001; RASMUSSEN; WILLIAMS, 2006; LUQUE et al., 2025).</w:t>
+        <w:lastRenderedPageBreak/>
+        <w:t>Impurity — MDI), que mede a contribuição de cada feature para a redução do erro nas divisões internas das árvores (BREIMAN, 2001; PEDREGOSA et al., 2011).</w:t>
       </w:r>
     </w:p>
     <w:p>
       <w:pPr>
-        <w:pStyle w:val="Ttulo1"/>
+        <w:pStyle w:val="Ttulo2"/>
+        <w:jc w:val="left"/>
         <w:rPr>
           <w:lang w:val="pt-BR"/>
         </w:rPr>
@@ -1561,7 +1267,7 @@
           <w:rFonts w:ascii="Arial" w:eastAsia="Arial" w:hAnsi="Arial"/>
           <w:lang w:val="pt-BR"/>
         </w:rPr>
-        <w:t>METODOLOGIA</w:t>
+        <w:t>O modelo MLBatLife e estratégias de operação</w:t>
       </w:r>
     </w:p>
     <w:p>
@@ -1575,26 +1281,22 @@
           <w:color w:val="000000"/>
           <w:lang w:val="pt-BR"/>
         </w:rPr>
-        <w:t>Este artigo caracteriza-se como uma pesquisa aplicada, de abordagem quantitativa e procedimento experimental, pois apresenta o desenvolvimento de uma solução computacional para apoiar a manutenção preditiva de baterias em sistemas fotovoltaicos. A pesquisa foi conduzida por meio da preparação de dados, treinamento de modelos de aprendizado de máquina e avaliação do desempenho preditivo por métricas estatísticas (PEDREGOSA et al., 2011; LUQUE et al., 2025).</w:t>
+        <w:t>O MLBatLife (LUQUE et al., 2025) é um modelo preditivo pré-treinado baseado em Random Forest, desenvolvido para estimar a degradação de baterias em sistemas fotovoltaicos residenciais a partir de perfis de potência residual. O modelo integra a extração de variáveis diárias e a estimativa da perda de capacidade em um pipeline automatizado, eliminando a necessidade de engenharia de features manual. Entre as estratégias de operação da bateria disponíveis no modelo, a estratégia Greedy prioriza o autoconsumo imediato da energia excedente, carregando e descarregando a bateria sem limitar a profundidade de descarga. Essa estratégia representa o comportamento padrão de sistemas residenciais sem gerenciamento otimizado e tende a impor ciclos mais intensos à bateria em comparação com estratégias que restringem a profundidade de descarga ou otimizam o despacho (LUQUE et al., 2025).</w:t>
       </w:r>
     </w:p>
     <w:p>
       <w:pPr>
-        <w:rPr>
-          <w:lang w:val="pt-BR"/>
-        </w:rPr>
-      </w:pPr>
-      <w:r>
-        <w:rPr>
-          <w:lang w:val="pt-BR"/>
-        </w:rPr>
-        <w:t>As variáveis diárias utilizadas no modelo são derivadas do perfil de potência residual: a média diária da potência residual (T1) e a média do valor absoluto da potência residual (T4). Esses atributos resumem o comportamento diário de carga e descarga e são combinados com o SOH inicial, a estratégia operacional e o índice de dia para estimar a perda de capacidade. A abordagem segue a metodologia de aprendizado de máquina descrita por Luque et al. (2025), com foco em manutenção preditiva e análise da degradaç</w:t>
-      </w:r>
-      <w:r>
-        <w:rPr>
-          <w:lang w:val="pt-BR"/>
-        </w:rPr>
-        <w:t>ão.</w:t>
+        <w:pStyle w:val="Ttulo1"/>
+        <w:rPr>
+          <w:lang w:val="pt-BR"/>
+        </w:rPr>
+      </w:pPr>
+      <w:r>
+        <w:rPr>
+          <w:rFonts w:ascii="Arial" w:eastAsia="Arial" w:hAnsi="Arial"/>
+          <w:lang w:val="pt-BR"/>
+        </w:rPr>
+        <w:t>METODOLOGIA</w:t>
       </w:r>
     </w:p>
     <w:p>
@@ -1608,15 +1310,7 @@
           <w:color w:val="000000"/>
           <w:lang w:val="pt-BR"/>
         </w:rPr>
-        <w:t xml:space="preserve">Para avaliar o impacto de diferentes perfis de consumo na degradação da bateria, foram utilizadas duas fontes de dados complementares. A primeira consiste em dados reais de consumo e geração fotovoltaica de residências alemãs, obtidos do projeto Open Power System Data (OPSD), que disponibiliza medições de energia em resolução de um minuto, incluindo importação e exportação da rede e geração fotovoltaica (OPEN POWER SYSTEM DATA, 2020). Foram selecionadas três </w:t>
-      </w:r>
-      <w:r>
-        <w:rPr>
-          <w:color w:val="000000"/>
-          <w:lang w:val="pt-BR"/>
-        </w:rPr>
-        <w:lastRenderedPageBreak/>
-        <w:t>residências (Residencial Alemão A, Residencial Alemão B e Residencial Alemão C) com períodos de dados completos variando de 495 a 847 dias.</w:t>
+        <w:t>Este artigo caracteriza-se como uma pesquisa aplicada, de abordagem quantitativa e procedimento experimental, pois apresenta o desenvolvimento de uma solução computacional para apoiar a manutenção preditiva de baterias em sistemas fotovoltaicos. A pesquisa foi conduzida por meio da preparação de dados, treinamento de modelos de aprendizado de máquina e avaliação do desempenho preditivo por métricas estatísticas (PEDREGOSA et al., 2011; LUQUE et al., 2025).</w:t>
       </w:r>
     </w:p>
     <w:p>
@@ -1629,111 +1323,7 @@
         <w:rPr>
           <w:lang w:val="pt-BR"/>
         </w:rPr>
-        <w:t xml:space="preserve">A segunda fonte consiste em um perfil sintético representativo de uma residência brasileira na cidade de </w:t>
-      </w:r>
-      <w:proofErr w:type="spellStart"/>
-      <w:r>
-        <w:rPr>
-          <w:lang w:val="pt-BR"/>
-        </w:rPr>
-        <w:t>Vitória-ES</w:t>
-      </w:r>
-      <w:proofErr w:type="spellEnd"/>
-      <w:r>
-        <w:rPr>
-          <w:lang w:val="pt-BR"/>
-        </w:rPr>
-        <w:t>, construído a partir da combinação de duas bases: (i) a curva de carga residencial típica publicada pela pesquisa de posse e hábitos de uso de equipamentos elétricos (PPH) do Programa Nacional de Conservação de Energia Elétrica (PROCEL/ELETROBRAS, 2019), que fornece a distribuição horária normalizada do consumo; e (</w:t>
-      </w:r>
-      <w:proofErr w:type="spellStart"/>
-      <w:r>
-        <w:rPr>
-          <w:lang w:val="pt-BR"/>
-        </w:rPr>
-        <w:t>ii</w:t>
-      </w:r>
-      <w:proofErr w:type="spellEnd"/>
-      <w:r>
-        <w:rPr>
-          <w:lang w:val="pt-BR"/>
-        </w:rPr>
-        <w:t xml:space="preserve">) dados de irradiância solar e geração fotovoltaica estimados pelo </w:t>
-      </w:r>
-      <w:proofErr w:type="spellStart"/>
-      <w:r>
-        <w:rPr>
-          <w:lang w:val="pt-BR"/>
-        </w:rPr>
-        <w:t>Photovoltaic</w:t>
-      </w:r>
-      <w:proofErr w:type="spellEnd"/>
-      <w:r>
-        <w:rPr>
-          <w:lang w:val="pt-BR"/>
-        </w:rPr>
-        <w:t xml:space="preserve"> </w:t>
-      </w:r>
-      <w:proofErr w:type="spellStart"/>
-      <w:r>
-        <w:rPr>
-          <w:lang w:val="pt-BR"/>
-        </w:rPr>
-        <w:t>Geographical</w:t>
-      </w:r>
-      <w:proofErr w:type="spellEnd"/>
-      <w:r>
-        <w:rPr>
-          <w:lang w:val="pt-BR"/>
-        </w:rPr>
-        <w:t xml:space="preserve"> </w:t>
-      </w:r>
-      <w:proofErr w:type="spellStart"/>
-      <w:r>
-        <w:rPr>
-          <w:lang w:val="pt-BR"/>
-        </w:rPr>
-        <w:t>Information</w:t>
-      </w:r>
-      <w:proofErr w:type="spellEnd"/>
-      <w:r>
-        <w:rPr>
-          <w:lang w:val="pt-BR"/>
-        </w:rPr>
-        <w:t xml:space="preserve"> System (PVGIS) do Joint </w:t>
-      </w:r>
-      <w:proofErr w:type="spellStart"/>
-      <w:r>
-        <w:rPr>
-          <w:lang w:val="pt-BR"/>
-        </w:rPr>
-        <w:t>Research</w:t>
-      </w:r>
-      <w:proofErr w:type="spellEnd"/>
-      <w:r>
-        <w:rPr>
-          <w:lang w:val="pt-BR"/>
-        </w:rPr>
-        <w:t xml:space="preserve"> Centre da Comissão Europeia, utilizando a ba</w:t>
-      </w:r>
-      <w:r>
-        <w:rPr>
-          <w:lang w:val="pt-BR"/>
-        </w:rPr>
-        <w:t xml:space="preserve">se de dados ERA5 com resolução horária para a localidade de Vitória (latitude −20,32°, longitude −40,34°) (HULD et al., 2012). O perfil foi parametrizado para um consumo mensal de 200 kWh e um sistema fotovoltaico de 5 </w:t>
-      </w:r>
-      <w:proofErr w:type="spellStart"/>
-      <w:r>
-        <w:rPr>
-          <w:lang w:val="pt-BR"/>
-        </w:rPr>
-        <w:t>kWp</w:t>
-      </w:r>
-      <w:proofErr w:type="spellEnd"/>
-      <w:r>
-        <w:rPr>
-          <w:lang w:val="pt-BR"/>
-        </w:rPr>
-        <w:t>, resultando em 1.825 dias de dados.</w:t>
+        <w:t>O modelo preditivo utilizado neste trabalho é o MLBatLife (LUQUE et al., 2025), um regressor baseado em Random Forest pré-treinado com 50 estimadores e profundidade máxima de 30 níveis (BREIMAN, 2001). O pipeline do modelo recebe como entrada um arquivo CSV contendo medições minuto a minuto de potência residual (diferença entre consumo e geração fotovoltaica) e executa automaticamente três etapas: (i) extração de variáveis diárias derivadas do perfil de potência, (ii) predição da perda incremental de capacidade para cada dia e (iii) acumulação dessas perdas para estimar a evolução do SOH ao longo do tempo. As cinco variáveis de entrada do modelo são: o SOH inicial do dia (SOH₀), duas estatísticas diárias extraídas do perfil de potência residual (T1 e T4), a estratégia operacional e o índice do dia de operação.</w:t>
       </w:r>
     </w:p>
     <w:p>
@@ -1744,43 +1334,11 @@
       </w:pPr>
       <w:r>
         <w:rPr>
-          <w:lang w:val="pt-BR"/>
-        </w:rPr>
-        <w:t xml:space="preserve">A conversão dos dados para o formato de entrada do </w:t>
-      </w:r>
-      <w:proofErr w:type="spellStart"/>
-      <w:r>
-        <w:rPr>
-          <w:lang w:val="pt-BR"/>
-        </w:rPr>
-        <w:t>MLBatLife</w:t>
-      </w:r>
-      <w:proofErr w:type="spellEnd"/>
-      <w:r>
-        <w:rPr>
-          <w:lang w:val="pt-BR"/>
-        </w:rPr>
-        <w:t xml:space="preserve"> foi realizada por meio de scripts Python desenvolvidos para este trabalho. Para os dados OPSD, a potência residual foi calculada como a diferença entre a variação de energia importada e exportada da rede em cada intervalo de um minuto, convertida para watts. Para o perfil brasileiro, a curva de carga horária foi interpolada para resolução de um minuto e combinada com a geração fotovoltaica estimada pelo PVGIS, igualmente interpolada. Em ambos os casos, o formato resultante consiste em um arquivo C</w:t>
-      </w:r>
-      <w:r>
-        <w:rPr>
-          <w:lang w:val="pt-BR"/>
-        </w:rPr>
-        <w:t xml:space="preserve">SV com colunas de tempo acumulado (em minutos) e potência residual (em watts), conforme especificação do </w:t>
-      </w:r>
-      <w:proofErr w:type="spellStart"/>
-      <w:r>
-        <w:rPr>
-          <w:lang w:val="pt-BR"/>
-        </w:rPr>
-        <w:t>MLBatLife</w:t>
-      </w:r>
-      <w:proofErr w:type="spellEnd"/>
-      <w:r>
-        <w:rPr>
-          <w:lang w:val="pt-BR"/>
-        </w:rPr>
-        <w:t xml:space="preserve"> (LUQUE et al., 2025).</w:t>
+          <w:color w:val="000000"/>
+          <w:lang w:val="pt-BR"/>
+        </w:rPr>
+        <w:lastRenderedPageBreak/>
+        <w:t>Para avaliar o impacto de diferentes perfis de consumo na degradação da bateria, foram utilizadas duas fontes de dados complementares. A primeira consiste em dados reais de consumo e geração fotovoltaica de residências alemãs, obtidos do projeto Open Power System Data (OPSD), que disponibiliza medições de energia em resolução de um minuto, incluindo importação e exportação da rede e geração fotovoltaica (OPEN POWER SYSTEM DATA, 2020). Foram selecionadas três residências (Residencial Alemão A, Residencial Alemão B e Residencial Alemão C) com períodos de dados completos variando de 495 a 847 dias.</w:t>
       </w:r>
     </w:p>
     <w:p>
@@ -1791,40 +1349,143 @@
       </w:pPr>
       <w:r>
         <w:rPr>
-          <w:color w:val="000000"/>
-          <w:lang w:val="pt-BR"/>
-        </w:rPr>
-        <w:t>O pré-processamento dos dados contemplou a verificação de valores ausentes, a remoção ou tratamento de outliers, a normalização das variáveis quando necessário, a criação de atributos derivados e a separação da base em conjuntos de treinamento e teste. Essa etapa é fundamental para reduzir distorções nos modelos e permitir uma avaliação mais consistente dos resultados obtidos (PEDREGOSA et al., 2011).</w:t>
+          <w:lang w:val="pt-BR"/>
+        </w:rPr>
+        <w:t>A segunda fonte consiste em um perfil sintético representativo de uma residência brasileira na cidade de Vitória-ES, construído a partir da combinação de duas bases: (i) a curva de carga residencial típica publicada pela pesquisa de posse e hábitos de uso de equipamentos elétricos (PPH) do Programa Nacional de Conservação de Energia Elétrica (PROCEL/ELETROBRAS, 2019), que fornece a distribuição horária normalizada do consumo; e (ii) dados de irradiância solar e geração fotovoltaica estimados pelo Photovoltaic Geographical Information System (PVGIS) do Joint Research Centre da Comissão Europeia, utilizando a base de dados ERA5 com resolução horária para a localidade de Vitória (latitude −20,32°, longitude −40,34°) (HULD et al., 2012). O perfil</w:t>
+      </w:r>
+      <w:r>
+        <w:rPr>
+          <w:lang w:val="pt-BR"/>
+        </w:rPr>
+        <w:t>, representado na figura 1,</w:t>
+      </w:r>
+      <w:r>
+        <w:rPr>
+          <w:lang w:val="pt-BR"/>
+        </w:rPr>
+        <w:t xml:space="preserve"> foi parametrizado para um consumo mensal de 200 kWh e um sistema fotovoltaico de 5 kWp, resultando em 1.825 dias de dados.</w:t>
       </w:r>
     </w:p>
     <w:p>
       <w:pPr>
-        <w:rPr>
-          <w:lang w:val="pt-BR"/>
-        </w:rPr>
-      </w:pPr>
-      <w:r>
-        <w:rPr>
-          <w:lang w:val="pt-BR"/>
-        </w:rPr>
-        <w:t>Na etapa de modelagem, o MLBatLife foi utilizado como baseline, por empregar Random Forest treinado para estimar a perda diária de capacidade. Em paralelo, foram avaliados modelos de regressão para estimativa do SOH e modelos de classificação para identificação da condição operacional da bateria (BREIMAN, 2001; CHEN; GUESTRIN, 2016).</w:t>
-      </w:r>
-      <w:proofErr w:type="spellStart"/>
-      <w:r>
-        <w:rPr>
-          <w:lang w:val="pt-BR"/>
-        </w:rPr>
-      </w:r>
-      <w:proofErr w:type="spellEnd"/>
-      <w:r>
-        <w:rPr>
-          <w:lang w:val="pt-BR"/>
-        </w:rPr>
+        <w:pStyle w:val="TtulodeFiguras"/>
+      </w:pPr>
+      <w:r>
+        <w:t xml:space="preserve">Figura 1 </w:t>
+      </w:r>
+      <w:r>
+        <w:t>–</w:t>
+      </w:r>
+      <w:r>
+        <w:t xml:space="preserve"> </w:t>
+      </w:r>
+      <w:r>
+        <w:t>P</w:t>
+      </w:r>
+      <w:r>
+        <w:t>erfil</w:t>
+      </w:r>
+      <w:r>
+        <w:t xml:space="preserve"> </w:t>
+      </w:r>
+      <w:r>
+        <w:t>horário de Vitória-ES (</w:t>
+      </w:r>
+      <w:r>
+        <w:t>sintético</w:t>
+      </w:r>
+      <w:r>
+        <w:t xml:space="preserve">) </w:t>
       </w:r>
     </w:p>
     <w:p>
       <w:pPr>
-        <w:pStyle w:val="LegendaTCC"/>
+        <w:ind w:firstLine="0"/>
+        <w:jc w:val="center"/>
+        <w:rPr>
+          <w:lang w:val="pt-BR"/>
+        </w:rPr>
+      </w:pPr>
+      <w:r>
+        <w:rPr>
+          <w:noProof/>
+          <w:lang w:val="pt-BR"/>
+        </w:rPr>
+        <w:drawing>
+          <wp:inline distT="0" distB="0" distL="0" distR="0" wp14:anchorId="34FB5148" wp14:editId="15473C8E">
+            <wp:extent cx="5760720" cy="1887855"/>
+            <wp:effectExtent l="0" t="0" r="0" b="0"/>
+            <wp:docPr id="1579822583" name="Imagem 1"/>
+            <wp:cNvGraphicFramePr>
+              <a:graphicFrameLocks xmlns:a="http://schemas.openxmlformats.org/drawingml/2006/main" noChangeAspect="1"/>
+            </wp:cNvGraphicFramePr>
+            <a:graphic xmlns:a="http://schemas.openxmlformats.org/drawingml/2006/main">
+              <a:graphicData uri="http://schemas.openxmlformats.org/drawingml/2006/picture">
+                <pic:pic xmlns:pic="http://schemas.openxmlformats.org/drawingml/2006/picture">
+                  <pic:nvPicPr>
+                    <pic:cNvPr id="1579822583" name=""/>
+                    <pic:cNvPicPr/>
+                  </pic:nvPicPr>
+                  <pic:blipFill>
+                    <a:blip r:embed="rId10"/>
+                    <a:stretch>
+                      <a:fillRect/>
+                    </a:stretch>
+                  </pic:blipFill>
+                  <pic:spPr>
+                    <a:xfrm>
+                      <a:off x="0" y="0"/>
+                      <a:ext cx="5760720" cy="1887855"/>
+                    </a:xfrm>
+                    <a:prstGeom prst="rect">
+                      <a:avLst/>
+                    </a:prstGeom>
+                  </pic:spPr>
+                </pic:pic>
+              </a:graphicData>
+            </a:graphic>
+          </wp:inline>
+        </w:drawing>
+      </w:r>
+    </w:p>
+    <w:p>
+      <w:pPr>
+        <w:pStyle w:val="TtulodeFiguras"/>
+      </w:pPr>
+      <w:r>
+        <w:t>Fonte: Elaborado pelos autores.</w:t>
+      </w:r>
+    </w:p>
+    <w:p>
+      <w:pPr>
+        <w:jc w:val="center"/>
+        <w:rPr>
+          <w:lang w:val="pt-BR"/>
+        </w:rPr>
+      </w:pPr>
+    </w:p>
+    <w:p>
+      <w:pPr>
+        <w:rPr>
+          <w:lang w:val="pt-BR"/>
+        </w:rPr>
+      </w:pPr>
+      <w:r>
+        <w:rPr>
+          <w:lang w:val="pt-BR"/>
+        </w:rPr>
+        <w:t xml:space="preserve">A conversão dos dados para o formato de entrada do MLBatLife foi realizada por meio de scripts Python desenvolvidos para este trabalho. Para os dados OPSD, a potência residual foi calculada como a diferença entre a variação de energia importada </w:t>
+      </w:r>
+      <w:r>
+        <w:rPr>
+          <w:lang w:val="pt-BR"/>
+        </w:rPr>
+        <w:lastRenderedPageBreak/>
+        <w:t>e exportada da rede em cada intervalo de um minuto, convertida para watts. Para o perfil brasileiro, a curva de carga horária foi interpolada para resolução de um minuto e combinada com a geração fotovoltaica estimada pelo PVGIS, igualmente interpolada. Em ambos os casos, o formato resultante consiste em um arquivo CSV com colunas de tempo acumulado (em minutos) e potência residual (em watts), conforme especificação do MLBatLife (LUQUE et al., 2025).</w:t>
+      </w:r>
+    </w:p>
+    <w:p>
+      <w:pPr>
         <w:rPr>
           <w:lang w:val="pt-BR"/>
         </w:rPr>
@@ -1834,7 +1495,40 @@
           <w:color w:val="000000"/>
           <w:lang w:val="pt-BR"/>
         </w:rPr>
-        <w:lastRenderedPageBreak/>
+        <w:t>O pré-processamento dos dados contemplou a verificação de valores ausentes, a remoção ou tratamento de outliers, a normalização das variáveis quando necessário, a criação de atributos derivados e a separação da base em conjuntos de treinamento e teste. Essa etapa é fundamental para reduzir distorções nos modelos e permitir uma avaliação mais consistente dos resultados obtidos (PEDREGOSA et al., 2011).</w:t>
+      </w:r>
+    </w:p>
+    <w:p>
+      <w:pPr>
+        <w:rPr>
+          <w:lang w:val="pt-BR"/>
+        </w:rPr>
+      </w:pPr>
+      <w:r>
+        <w:rPr>
+          <w:lang w:val="pt-BR"/>
+        </w:rPr>
+        <w:t>Na etapa de modelagem, o MLBatLife foi utilizado como baseline, por empregar Random Forest treinado para estimar a perda diária de capacidade. Em paralelo, foram avaliados modelos de regressão para estimativa do SOH e modelos de classificação para identificação da condição operacional da bateria (BREIMAN, 2001; CHEN; GUESTRIN, 2016).</w:t>
+      </w:r>
+    </w:p>
+    <w:p>
+      <w:pPr>
+        <w:rPr>
+          <w:lang w:val="pt-BR"/>
+        </w:rPr>
+      </w:pPr>
+      <w:r>
+        <w:rPr>
+          <w:lang w:val="pt-BR"/>
+        </w:rPr>
+        <w:t>Para a estimativa do fim de vida útil (EOL), optou-se pela regressão linear sobre a curva de SOH em vez de estender as predições do Random Forest além do período observado. Essa escolha decorre de uma limitação inerente a modelos baseados em árvores de decisão: por operarem mediante partições do espaço de features, esses modelos não extrapolam tendências para valores de entrada fora do domínio de treinamento, retornando a predição do nó folha mais próximo (BREIMAN, 2001). Como a degradação da bateria após o período inicial de formação da camada SEI segue um regime aproximadamente linear (BARRÉ et al., 2013), a regressão linear permite projetar o EOL de forma confiável, ancorando a projeção no último SOH observado.</w:t>
+      </w:r>
+    </w:p>
+    <w:p>
+      <w:pPr>
+        <w:pStyle w:val="TtulodeFiguras"/>
+      </w:pPr>
+      <w:r>
         <w:t>Tabela 1 - Métricas previstas para avaliação dos modelos</w:t>
       </w:r>
     </w:p>
@@ -1877,17 +1571,8 @@
                 <w:b/>
                 <w:sz w:val="20"/>
               </w:rPr>
-              <w:t xml:space="preserve">Tipo de </w:t>
+              <w:t>Tipo de tarefa</w:t>
             </w:r>
-            <w:proofErr w:type="spellStart"/>
-            <w:r>
-              <w:rPr>
-                <w:b/>
-                <w:sz w:val="20"/>
-              </w:rPr>
-              <w:t>tarefa</w:t>
-            </w:r>
-            <w:proofErr w:type="spellEnd"/>
           </w:p>
         </w:tc>
         <w:tc>
@@ -1907,7 +1592,6 @@
               <w:ind w:firstLine="0"/>
               <w:jc w:val="center"/>
             </w:pPr>
-            <w:proofErr w:type="spellStart"/>
             <w:r>
               <w:rPr>
                 <w:b/>
@@ -1915,7 +1599,6 @@
               </w:rPr>
               <w:t>Métrica</w:t>
             </w:r>
-            <w:proofErr w:type="spellEnd"/>
           </w:p>
         </w:tc>
         <w:tc>
@@ -1935,7 +1618,6 @@
               <w:ind w:firstLine="32"/>
               <w:jc w:val="center"/>
             </w:pPr>
-            <w:proofErr w:type="spellStart"/>
             <w:r>
               <w:rPr>
                 <w:b/>
@@ -1943,7 +1625,6 @@
               </w:rPr>
               <w:t>Finalidade</w:t>
             </w:r>
-            <w:proofErr w:type="spellEnd"/>
           </w:p>
         </w:tc>
         <w:tc>
@@ -1963,31 +1644,13 @@
               <w:ind w:firstLine="0"/>
               <w:jc w:val="center"/>
             </w:pPr>
-            <w:proofErr w:type="spellStart"/>
             <w:r>
               <w:rPr>
                 <w:b/>
                 <w:sz w:val="20"/>
               </w:rPr>
-              <w:t>Referência</w:t>
+              <w:t>Referência de apoio</w:t>
             </w:r>
-            <w:proofErr w:type="spellEnd"/>
-            <w:r>
-              <w:rPr>
-                <w:b/>
-                <w:sz w:val="20"/>
-              </w:rPr>
-              <w:t xml:space="preserve"> de </w:t>
-            </w:r>
-            <w:proofErr w:type="spellStart"/>
-            <w:r>
-              <w:rPr>
-                <w:b/>
-                <w:sz w:val="20"/>
-              </w:rPr>
-              <w:t>apoio</w:t>
-            </w:r>
-            <w:proofErr w:type="spellEnd"/>
           </w:p>
         </w:tc>
       </w:tr>
@@ -2011,14 +1674,12 @@
               <w:ind w:firstLine="0"/>
               <w:jc w:val="left"/>
             </w:pPr>
-            <w:proofErr w:type="spellStart"/>
             <w:r>
               <w:rPr>
                 <w:sz w:val="20"/>
               </w:rPr>
               <w:t>Regressão</w:t>
             </w:r>
-            <w:proofErr w:type="spellEnd"/>
           </w:p>
         </w:tc>
         <w:tc>
@@ -2118,14 +1779,12 @@
               <w:ind w:firstLine="0"/>
               <w:jc w:val="left"/>
             </w:pPr>
-            <w:proofErr w:type="spellStart"/>
             <w:r>
               <w:rPr>
                 <w:sz w:val="20"/>
               </w:rPr>
               <w:t>Classificação</w:t>
             </w:r>
-            <w:proofErr w:type="spellEnd"/>
           </w:p>
         </w:tc>
         <w:tc>
@@ -2200,19 +1859,11 @@
               <w:ind w:firstLine="0"/>
               <w:jc w:val="left"/>
             </w:pPr>
-            <w:proofErr w:type="spellStart"/>
             <w:r>
               <w:rPr>
                 <w:sz w:val="20"/>
               </w:rPr>
-              <w:t>Aitio</w:t>
-            </w:r>
-            <w:proofErr w:type="spellEnd"/>
-            <w:r>
-              <w:rPr>
-                <w:sz w:val="20"/>
-              </w:rPr>
-              <w:t xml:space="preserve"> e Howey (2021)</w:t>
+              <w:t>Aitio e Howey (2021)</w:t>
             </w:r>
           </w:p>
         </w:tc>
@@ -2237,14 +1888,12 @@
               <w:ind w:firstLine="0"/>
               <w:jc w:val="left"/>
             </w:pPr>
-            <w:proofErr w:type="spellStart"/>
             <w:r>
               <w:rPr>
                 <w:sz w:val="20"/>
               </w:rPr>
               <w:t>Interpretação</w:t>
             </w:r>
-            <w:proofErr w:type="spellEnd"/>
           </w:p>
         </w:tc>
         <w:tc>
@@ -2263,28 +1912,12 @@
               <w:ind w:firstLine="0"/>
               <w:jc w:val="center"/>
             </w:pPr>
-            <w:proofErr w:type="spellStart"/>
             <w:r>
               <w:rPr>
                 <w:sz w:val="20"/>
               </w:rPr>
-              <w:t>Importância</w:t>
+              <w:t>Importância das variáveis</w:t>
             </w:r>
-            <w:proofErr w:type="spellEnd"/>
-            <w:r>
-              <w:rPr>
-                <w:sz w:val="20"/>
-              </w:rPr>
-              <w:t xml:space="preserve"> das </w:t>
-            </w:r>
-            <w:proofErr w:type="spellStart"/>
-            <w:r>
-              <w:rPr>
-                <w:sz w:val="20"/>
-              </w:rPr>
-              <w:t>variáveis</w:t>
-            </w:r>
-            <w:proofErr w:type="spellEnd"/>
           </w:p>
         </w:tc>
         <w:tc>
@@ -2331,19 +1964,11 @@
               <w:ind w:firstLine="0"/>
               <w:jc w:val="left"/>
             </w:pPr>
-            <w:proofErr w:type="spellStart"/>
             <w:r>
               <w:rPr>
                 <w:sz w:val="20"/>
               </w:rPr>
-              <w:t>Breiman</w:t>
-            </w:r>
-            <w:proofErr w:type="spellEnd"/>
-            <w:r>
-              <w:rPr>
-                <w:sz w:val="20"/>
-              </w:rPr>
-              <w:t xml:space="preserve"> (2001)</w:t>
+              <w:t>Breiman (2001)</w:t>
             </w:r>
           </w:p>
         </w:tc>
@@ -2355,31 +1980,7 @@
         <w:spacing w:before="60" w:after="160"/>
       </w:pPr>
       <w:r>
-        <w:t xml:space="preserve">Fonte: </w:t>
-      </w:r>
-      <w:proofErr w:type="spellStart"/>
-      <w:r>
-        <w:t>Elaborado</w:t>
-      </w:r>
-      <w:proofErr w:type="spellEnd"/>
-      <w:r>
-        <w:t xml:space="preserve"> </w:t>
-      </w:r>
-      <w:proofErr w:type="spellStart"/>
-      <w:r>
-        <w:t>pelos</w:t>
-      </w:r>
-      <w:proofErr w:type="spellEnd"/>
-      <w:r>
-        <w:t xml:space="preserve"> </w:t>
-      </w:r>
-      <w:proofErr w:type="spellStart"/>
-      <w:r>
-        <w:t>autores</w:t>
-      </w:r>
-      <w:proofErr w:type="spellEnd"/>
-      <w:r>
-        <w:t>.</w:t>
+        <w:t>Fonte: Elaborado pelos autores.</w:t>
       </w:r>
     </w:p>
     <w:p>
@@ -2392,25 +1993,52 @@
         <w:rPr>
           <w:lang w:val="pt-BR"/>
         </w:rPr>
-        <w:t xml:space="preserve">A implementação foi realizada em linguagem Python, com uso de bibliotecas para manipulação de dados, treinamento dos modelos e geração de gráficos, além dos scripts do próprio </w:t>
-      </w:r>
-      <w:proofErr w:type="spellStart"/>
-      <w:r>
-        <w:rPr>
-          <w:lang w:val="pt-BR"/>
-        </w:rPr>
-        <w:t>MLBatLife</w:t>
-      </w:r>
-      <w:proofErr w:type="spellEnd"/>
-      <w:r>
-        <w:rPr>
-          <w:lang w:val="pt-BR"/>
-        </w:rPr>
-        <w:t xml:space="preserve"> para leitura do CSV, extração de features e predição do SOH.</w:t>
+        <w:lastRenderedPageBreak/>
+        <w:t>A implementação foi realizada em linguagem Python, com uso de bibliotecas para manipulação de dados, treinamento dos modelos e geração de gráficos, além dos scripts do próprio MLBatLife para leitura do CSV, extração de features e predição do SOH.</w:t>
       </w:r>
     </w:p>
     <w:p>
       <w:pPr>
+        <w:jc w:val="center"/>
+        <w:rPr>
+          <w:sz w:val="20"/>
+          <w:szCs w:val="18"/>
+          <w:lang w:val="pt-BR"/>
+        </w:rPr>
+      </w:pPr>
+    </w:p>
+    <w:p>
+      <w:pPr>
+        <w:pStyle w:val="Ttulo1"/>
+        <w:rPr>
+          <w:lang w:val="pt-BR"/>
+        </w:rPr>
+      </w:pPr>
+      <w:r>
+        <w:rPr>
+          <w:rFonts w:ascii="Arial" w:eastAsia="Arial" w:hAnsi="Arial"/>
+          <w:lang w:val="pt-BR"/>
+        </w:rPr>
+        <w:t>RESULTADOS E DISCUSSÃO</w:t>
+      </w:r>
+    </w:p>
+    <w:p>
+      <w:pPr>
+        <w:rPr>
+          <w:color w:val="000000"/>
+          <w:lang w:val="pt-BR"/>
+        </w:rPr>
+      </w:pPr>
+      <w:r>
+        <w:rPr>
+          <w:color w:val="000000"/>
+          <w:lang w:val="pt-BR"/>
+        </w:rPr>
+        <w:t>A aplicação do modelo MLBatLife aos quatro perfis de potência residual permitiu estimar a evolução diária do SOH para cada cenário. O Gráfico 1 apresenta o perfil médio diário de potência residual para os quatro cenários, evidenciando os períodos de excedente solar (potência negativa) e de consumo da rede (potência positiva) ao longo das 24 horas. Os perfis OPSD representam condições reais de residências alemãs com diferentes padrões de consumo e capacidade fotovoltaica, enquanto o perfil brasileiro simula uma residência típica em Vitória-ES com sistema de 5 kWp. Todos os cenários utilizaram estratégia Greedy (SOH₀ = 1,0, Qnom = 5 kWh), que prioriza o autoconsumo imediato sem limitar a profundidade de descarga (LUQUE et al., 2025).</w:t>
+      </w:r>
+    </w:p>
+    <w:p>
+      <w:pPr>
         <w:pStyle w:val="LegendaTCC"/>
         <w:rPr>
           <w:lang w:val="pt-BR"/>
@@ -2421,7 +2049,7 @@
           <w:lang w:val="pt-BR"/>
         </w:rPr>
         <w:lastRenderedPageBreak/>
-        <w:t>Gráfico 2</w:t>
+        <w:t>Gráfico 1</w:t>
       </w:r>
       <w:r>
         <w:rPr>
@@ -2434,7 +2062,7 @@
           <w:noProof/>
         </w:rPr>
         <w:drawing>
-          <wp:inline distT="0" distB="0" distL="0" distR="0" wp14:anchorId="79C453F3" wp14:editId="0B5CAAD5">
+          <wp:inline distT="0" distB="0" distL="0" distR="0" wp14:anchorId="4A531615" wp14:editId="7082FE5D">
             <wp:extent cx="6089650" cy="6219092"/>
             <wp:effectExtent l="0" t="0" r="6350" b="0"/>
             <wp:docPr id="4" name="Picture 4"/>
@@ -2449,7 +2077,7 @@
                     <pic:cNvPicPr/>
                   </pic:nvPicPr>
                   <pic:blipFill rotWithShape="1">
-                    <a:blip r:embed="rId9"/>
+                    <a:blip r:embed="rId11"/>
                     <a:srcRect t="4480"/>
                     <a:stretch>
                       <a:fillRect/>
@@ -2481,188 +2109,45 @@
     </w:p>
     <w:p>
       <w:pPr>
-        <w:jc w:val="center"/>
+        <w:rPr>
+          <w:lang w:val="pt-BR"/>
+        </w:rPr>
+      </w:pPr>
+      <w:r>
         <w:rPr>
           <w:sz w:val="20"/>
           <w:szCs w:val="18"/>
           <w:lang w:val="pt-BR"/>
         </w:rPr>
-      </w:pPr>
-      <w:r>
-        <w:rPr>
-          <w:sz w:val="20"/>
-          <w:szCs w:val="18"/>
-          <w:lang w:val="pt-BR"/>
-        </w:rPr>
-        <w:t>F</w:t>
-      </w:r>
-      <w:r>
-        <w:rPr>
-          <w:sz w:val="20"/>
-          <w:szCs w:val="18"/>
-          <w:lang w:val="pt-BR"/>
-        </w:rPr>
-        <w:t>onte: Elaborado pelos autores.</w:t>
+        <w:t>Fonte: Elaborado pelos autores.</w:t>
       </w:r>
     </w:p>
     <w:p>
       <w:pPr>
-        <w:pStyle w:val="Ttulo1"/>
-        <w:rPr>
-          <w:lang w:val="pt-BR"/>
-        </w:rPr>
-      </w:pPr>
-      <w:r>
-        <w:rPr>
-          <w:rFonts w:ascii="Arial" w:eastAsia="Arial" w:hAnsi="Arial"/>
-          <w:lang w:val="pt-BR"/>
-        </w:rPr>
-        <w:t>RESULTADOS E DISCUSSÃO</w:t>
+        <w:rPr>
+          <w:lang w:val="pt-BR"/>
+        </w:rPr>
+      </w:pPr>
+      <w:r>
+        <w:rPr>
+          <w:color w:val="000000"/>
+          <w:lang w:val="pt-BR"/>
+        </w:rPr>
+        <w:t>A Tabela 2 apresenta os resultados consolidados da estimativa de SOH para os quatro perfis analisados. O perfil brasileiro (Vitória-ES) apresentou a maior degradação, com SOH final de 0,8055 após 1.825 dias (5 anos), enquanto os perfis alemães, com períodos de observação menores (495 a 847 dias), mantiveram o SOH acima de 0,89. Essa diferença decorre tanto da maior duração do perfil brasileiro quanto do balanço energético negativo (T1 médio de −616,6 W), indicando que a geração fotovoltaica supera consistentemente o consumo, resultando em ciclos diários mais intensos de carga e descarga da bateria (LUQUE et al., 2025; AITIO; HOWEY, 2021).</w:t>
       </w:r>
     </w:p>
     <w:p>
       <w:pPr>
-        <w:rPr>
-          <w:lang w:val="pt-BR"/>
-        </w:rPr>
-      </w:pPr>
-      <w:r>
-        <w:rPr>
-          <w:color w:val="000000"/>
-          <w:lang w:val="pt-BR"/>
-        </w:rPr>
-        <w:t xml:space="preserve">A aplicação do modelo </w:t>
-      </w:r>
-      <w:proofErr w:type="spellStart"/>
-      <w:r>
-        <w:rPr>
-          <w:color w:val="000000"/>
-          <w:lang w:val="pt-BR"/>
-        </w:rPr>
-        <w:t>MLBatLife</w:t>
-      </w:r>
-      <w:proofErr w:type="spellEnd"/>
-      <w:r>
-        <w:rPr>
-          <w:color w:val="000000"/>
-          <w:lang w:val="pt-BR"/>
-        </w:rPr>
-        <w:t xml:space="preserve"> aos quatro perfis de potência residual permitiu estimar a evolução diária do SOH para cada cenário. Os perfis OPSD representam condições reais de residências alemãs com diferentes padrões de consumo e capacidade fotovoltaica, enquanto o perfil brasileiro simula uma residência típica em </w:t>
-      </w:r>
-      <w:proofErr w:type="spellStart"/>
-      <w:r>
-        <w:rPr>
-          <w:color w:val="000000"/>
-          <w:lang w:val="pt-BR"/>
-        </w:rPr>
-        <w:t>Vitória-ES</w:t>
-      </w:r>
-      <w:proofErr w:type="spellEnd"/>
-      <w:r>
-        <w:rPr>
-          <w:color w:val="000000"/>
-          <w:lang w:val="pt-BR"/>
-        </w:rPr>
-        <w:t xml:space="preserve"> com sistema de 5 </w:t>
-      </w:r>
-      <w:proofErr w:type="spellStart"/>
-      <w:r>
-        <w:rPr>
-          <w:color w:val="000000"/>
-          <w:lang w:val="pt-BR"/>
-        </w:rPr>
-        <w:t>kWp</w:t>
-      </w:r>
-      <w:proofErr w:type="spellEnd"/>
-      <w:r>
-        <w:rPr>
-          <w:color w:val="000000"/>
-          <w:lang w:val="pt-BR"/>
-        </w:rPr>
-        <w:t xml:space="preserve">. Todos os cenários utilizaram estratégia </w:t>
-      </w:r>
-      <w:proofErr w:type="spellStart"/>
-      <w:r>
-        <w:rPr>
-          <w:color w:val="000000"/>
-          <w:lang w:val="pt-BR"/>
-        </w:rPr>
-        <w:t>Greedy</w:t>
-      </w:r>
-      <w:proofErr w:type="spellEnd"/>
-      <w:r>
-        <w:rPr>
-          <w:color w:val="000000"/>
-          <w:lang w:val="pt-BR"/>
-        </w:rPr>
-        <w:t xml:space="preserve"> (SOH₀ = 1,0, </w:t>
-      </w:r>
-      <w:proofErr w:type="spellStart"/>
-      <w:r>
-        <w:rPr>
-          <w:color w:val="000000"/>
-          <w:lang w:val="pt-BR"/>
-        </w:rPr>
-        <w:t>Qnom</w:t>
-      </w:r>
-      <w:proofErr w:type="spellEnd"/>
-      <w:r>
-        <w:rPr>
-          <w:color w:val="000000"/>
-          <w:lang w:val="pt-BR"/>
-        </w:rPr>
-        <w:t xml:space="preserve"> = 5 kWh), que prioriza o autoconsumo imediato sem limitar a profundidade de descarga (LUQUE et al., 2025).</w:t>
-      </w:r>
-    </w:p>
-    <w:p>
-      <w:pPr>
-        <w:rPr>
-          <w:lang w:val="pt-BR"/>
-        </w:rPr>
-      </w:pPr>
-      <w:r>
-        <w:rPr>
-          <w:color w:val="000000"/>
+        <w:pStyle w:val="LegendaTCC"/>
+        <w:rPr>
+          <w:lang w:val="pt-BR"/>
+        </w:rPr>
+      </w:pPr>
+      <w:r>
+        <w:rPr>
           <w:lang w:val="pt-BR"/>
         </w:rPr>
         <w:lastRenderedPageBreak/>
-        <w:t>A Tabela 2 apresenta os resultados consolidados da estimativa de SOH para os quatro perfis analisados. O perfil brasileiro (</w:t>
-      </w:r>
-      <w:proofErr w:type="spellStart"/>
-      <w:r>
-        <w:rPr>
-          <w:color w:val="000000"/>
-          <w:lang w:val="pt-BR"/>
-        </w:rPr>
-        <w:t>Vitória-ES</w:t>
-      </w:r>
-      <w:proofErr w:type="spellEnd"/>
-      <w:r>
-        <w:rPr>
-          <w:color w:val="000000"/>
-          <w:lang w:val="pt-BR"/>
-        </w:rPr>
-        <w:t>) apresentou a maior degradação, com SOH final de 0,8055 após 1.825 dias (5 anos), enquanto os perfis alemães, com períodos de observação menores (495 a 847 dias), mantiveram o SOH acima de 0,89. Essa diferença decorre tanto da maior duração do perfil brasileiro quanto do balanço energético negativo (T1 médio de −616,6 W), indicando que a geração fotovoltaica supera consistentemente o consumo, resultando em ciclos diários mais intensos de carga e descarga da bateria (LUQUE et al., 2025; AITIO; HOW</w:t>
-      </w:r>
-      <w:r>
-        <w:rPr>
-          <w:color w:val="000000"/>
-          <w:lang w:val="pt-BR"/>
-        </w:rPr>
-        <w:t>EY, 2021).</w:t>
-      </w:r>
-    </w:p>
-    <w:p>
-      <w:pPr>
-        <w:pStyle w:val="LegendaTCC"/>
-        <w:rPr>
-          <w:lang w:val="pt-BR"/>
-        </w:rPr>
-      </w:pPr>
-      <w:r>
-        <w:rPr>
-          <w:lang w:val="pt-BR"/>
-        </w:rPr>
         <w:t>Tabela 2 - Estimativa de SOH e fim de vida útil por perfil residencial</w:t>
       </w:r>
     </w:p>
@@ -2694,11 +2179,9 @@
               <w:spacing w:line="240" w:lineRule="auto"/>
               <w:ind w:firstLine="0"/>
             </w:pPr>
-            <w:proofErr w:type="spellStart"/>
             <w:r>
               <w:t>Perfil</w:t>
             </w:r>
-            <w:proofErr w:type="spellEnd"/>
           </w:p>
         </w:tc>
         <w:tc>
@@ -3139,21 +2622,7 @@
         <w:rPr>
           <w:lang w:val="pt-BR"/>
         </w:rPr>
-        <w:t xml:space="preserve">Fonte: Elaborado pelos autores com dados do </w:t>
-      </w:r>
-      <w:proofErr w:type="spellStart"/>
-      <w:r>
-        <w:rPr>
-          <w:lang w:val="pt-BR"/>
-        </w:rPr>
-        <w:t>MLBatLife</w:t>
-      </w:r>
-      <w:proofErr w:type="spellEnd"/>
-      <w:r>
-        <w:rPr>
-          <w:lang w:val="pt-BR"/>
-        </w:rPr>
-        <w:t>.</w:t>
+        <w:t>Fonte: Elaborado pelos autores com dados do MLBatLife.</w:t>
       </w:r>
     </w:p>
     <w:p>
@@ -3175,7 +2644,7 @@
           <w:color w:val="000000"/>
           <w:lang w:val="pt-BR"/>
         </w:rPr>
-        <w:t>A análise das features extraídas pelo MLBatLife revelou diferenças significativas entre os perfis. A feature T1 (média diária da potência residual) reflete o balanço entre geração e consumo: valores negativos indicam excedente solar, enquanto valores positivos indicam consumo predominante. A feature T4 (média absoluta da potência) quantifica a intensidade de uso do sistema, independentemente da direção do fluxo de energia (LUQUE et al., 2025).</w:t>
+        <w:t>A análise da importância das variáveis do modelo Random Forest (BREIMAN, 2001) revelou que o índice do dia de operação (Day) é a feature mais relevante para a estimativa de degradação, com importância de 61,5%, seguido pelo SOH inicial do dia (SOH₀) com 23,7%. A feature T1, que reflete o balanço médio diário entre geração e consumo, contribuiu com 10,8%, enquanto T4 (intensidade de uso) e a estratégia operacional apresentaram contribuições marginais (2,1% e 1,8%, respectivamente). Esse resultado indica que a degradação é predominantemente determinada pelo tempo de uso e pelo estado acumulado da bateria, enquanto o perfil de potência residual exerce influência secundária, porém mensurável, sobre a taxa de perda de capacidade (LUQUE et al., 2025).</w:t>
       </w:r>
     </w:p>
     <w:p>
@@ -3189,7 +2658,7 @@
           <w:color w:val="000000"/>
           <w:lang w:val="pt-BR"/>
         </w:rPr>
-        <w:t xml:space="preserve">Observou-se que a taxa de degradação não é uniforme ao longo do tempo. Nos primeiros dias de operação, a queda de SOH é mais acentuada, correspondendo à fase de formação da camada SEI (Solid Electrolyte Interphase), fenômeno bem documentado na literatura (DUBARRY; TRUCHOT; LIAW, 2012; BIRKL et al., 2017). Após esse período inicial (break-in), a degradação segue um regime </w:t>
+        <w:t xml:space="preserve">Observou-se que a taxa de degradação não é uniforme ao longo do tempo. Nos primeiros dias de operação, a queda de SOH é mais acentuada, correspondendo à fase de formação da camada SEI (Solid Electrolyte Interphase), fenômeno bem documentado na literatura (DUBARRY; TRUCHOT; LIAW, 2012; BIRKL et al., 2017). Após esse período inicial (break-in), a degradação segue um regime aproximadamente linear. Para a estimativa do fim de vida útil (EOL), adotou-se regressão linear sobre a curva completa de SOH, excluindo os primeiros 30 dias (break-in). O slope resultante foi aplicado a partir do último SOH observado, ancorando a projeção no estado mais recente da bateria. Essa abordagem é consistente com modelos de degradação linear em regime estacionário (BARRÉ et al., 2013) e com o conceito de vida útil remanescente (RUL) (XU et al., 2018). O limiar </w:t>
       </w:r>
       <w:r>
         <w:rPr>
@@ -3197,7 +2666,7 @@
           <w:lang w:val="pt-BR"/>
         </w:rPr>
         <w:lastRenderedPageBreak/>
-        <w:t>aproximadamente linear. Para a estimativa do fim de vida útil (EOL), adotou-se regressão linear sobre a curva completa de SOH, excluindo os primeiros 30 dias (break-in). O slope resultante foi aplicado a partir do último SOH observado, ancorando a projeção no estado mais recente da bateria. Essa abordagem é consistente com modelos de degradação linear em regime estacionário (BARRÉ et al., 2013) e com o conceito de vida útil remanescente (RUL) (XU et al., 2018). O limiar de EOL foi definido em SOH = 0,80, conforme a norma IEC 61427, amplamente adotada na literatura (SEVERSON et al., 2019).</w:t>
+        <w:t>de EOL foi definido em SOH = 0,80, conforme a norma IEC 61427, amplamente adotada na literatura (SEVERSON et al., 2019).</w:t>
       </w:r>
     </w:p>
     <w:p>
@@ -3211,7 +2680,19 @@
         <w:rPr>
           <w:lang w:val="pt-BR"/>
         </w:rPr>
-        <w:t>Gráfico 1 - Comparação da evolução do SOH entre perfis residenciais</w:t>
+        <w:t xml:space="preserve">Gráfico </w:t>
+      </w:r>
+      <w:r>
+        <w:rPr>
+          <w:lang w:val="pt-BR"/>
+        </w:rPr>
+        <w:t>2</w:t>
+      </w:r>
+      <w:r>
+        <w:rPr>
+          <w:lang w:val="pt-BR"/>
+        </w:rPr>
+        <w:t xml:space="preserve"> - Comparação da evolução do SOH entre perfis residenciais</w:t>
       </w:r>
     </w:p>
     <w:p>
@@ -3223,11 +2704,12 @@
       </w:pPr>
       <w:r>
         <w:rPr>
+          <w:noProof/>
           <w:lang w:val="pt-BR"/>
         </w:rPr>
         <w:drawing>
-          <wp:inline distT="0" distB="0" distL="0" distR="0" wp14:anchorId="088EFEC7" wp14:editId="0F762248">
-            <wp:extent cx="5760720" cy="2848610"/>
+          <wp:inline distT="0" distB="0" distL="0" distR="0" wp14:anchorId="088EFEC7" wp14:editId="033FAA5E">
+            <wp:extent cx="5798820" cy="2696210"/>
             <wp:effectExtent l="0" t="0" r="0" b="8890"/>
             <wp:docPr id="1428036953" name="Imagem 1"/>
             <wp:cNvGraphicFramePr>
@@ -3240,20 +2722,29 @@
                     <pic:cNvPr id="1428036953" name=""/>
                     <pic:cNvPicPr/>
                   </pic:nvPicPr>
-                  <pic:blipFill>
-                    <a:blip r:embed="rId10"/>
+                  <pic:blipFill rotWithShape="1">
+                    <a:blip r:embed="rId12"/>
+                    <a:srcRect t="5350"/>
                     <a:stretch>
                       <a:fillRect/>
                     </a:stretch>
                   </pic:blipFill>
-                  <pic:spPr>
+                  <pic:spPr bwMode="auto">
                     <a:xfrm>
                       <a:off x="0" y="0"/>
-                      <a:ext cx="5760720" cy="2848610"/>
+                      <a:ext cx="5798820" cy="2696210"/>
                     </a:xfrm>
                     <a:prstGeom prst="rect">
                       <a:avLst/>
                     </a:prstGeom>
+                    <a:ln>
+                      <a:noFill/>
+                    </a:ln>
+                    <a:extLst>
+                      <a:ext uri="{53640926-AAD7-44D8-BBD7-CCE9431645EC}">
+                        <a14:shadowObscured xmlns:a14="http://schemas.microsoft.com/office/drawing/2010/main"/>
+                      </a:ext>
+                    </a:extLst>
                   </pic:spPr>
                 </pic:pic>
               </a:graphicData>
@@ -3315,7 +2806,6 @@
           <w:rFonts w:ascii="Arial" w:eastAsia="Arial" w:hAnsi="Arial"/>
           <w:lang w:val="pt-BR"/>
         </w:rPr>
-        <w:lastRenderedPageBreak/>
         <w:t>CONSIDERAÇÕES FINAIS</w:t>
       </w:r>
     </w:p>
@@ -3330,39 +2820,15 @@
           <w:color w:val="000000"/>
           <w:lang w:val="pt-BR"/>
         </w:rPr>
-        <w:t xml:space="preserve">Este trabalho aplicou o modelo preditivo </w:t>
-      </w:r>
-      <w:proofErr w:type="spellStart"/>
+        <w:t xml:space="preserve">Este trabalho aplicou o modelo preditivo MLBatLife para estimar o estado de saúde de baterias em sistemas fotovoltaicos residenciais, comparando perfis de consumo de residências alemãs (dados OPSD) e de um cenário sintético brasileiro (Vitória-ES). Os resultados demonstraram que o padrão de consumo e a capacidade fotovoltaica instalada influenciam diretamente a taxa de degradação da bateria, com o perfil brasileiro apresentando SOH final de 0,8055 após cinco anos de operação </w:t>
+      </w:r>
       <w:r>
         <w:rPr>
           <w:color w:val="000000"/>
           <w:lang w:val="pt-BR"/>
         </w:rPr>
-        <w:t>MLBatLife</w:t>
-      </w:r>
-      <w:proofErr w:type="spellEnd"/>
-      <w:r>
-        <w:rPr>
-          <w:color w:val="000000"/>
-          <w:lang w:val="pt-BR"/>
-        </w:rPr>
-        <w:t xml:space="preserve"> para estimar o estado de saúde de baterias em sistemas fotovoltaicos residenciais, comparando perfis de consumo de residências alemãs (dados OPSD) e de um cenário sintético brasileiro (</w:t>
-      </w:r>
-      <w:proofErr w:type="spellStart"/>
-      <w:r>
-        <w:rPr>
-          <w:color w:val="000000"/>
-          <w:lang w:val="pt-BR"/>
-        </w:rPr>
-        <w:t>Vitória-ES</w:t>
-      </w:r>
-      <w:proofErr w:type="spellEnd"/>
-      <w:r>
-        <w:rPr>
-          <w:color w:val="000000"/>
-          <w:lang w:val="pt-BR"/>
-        </w:rPr>
-        <w:t>). Os resultados demonstraram que o padrão de consumo e a capacidade fotovoltaica instalada influenciam diretamente a taxa de degradação da bateria, com o perfil brasileiro apresentando SOH final de 0,8055 após cinco anos de operação simulada, próximo ao limiar convencional de fim de vida útil (LUQUE et al., 2025; AITIO; HOWEY, 2021).</w:t>
+        <w:lastRenderedPageBreak/>
+        <w:t>simulada, próximo ao limiar convencional de fim de vida útil (LUQUE et al., 2025; AITIO; HOWEY, 2021).</w:t>
       </w:r>
     </w:p>
     <w:p>
@@ -3376,39 +2842,7 @@
           <w:color w:val="000000"/>
           <w:lang w:val="pt-BR"/>
         </w:rPr>
-        <w:t xml:space="preserve">Como limitação, destaca-se que o perfil brasileiro foi construído a partir de dados sintéticos, combinando a curva de carga PROCEL com geração estimada pelo PVGIS, o que pode não representar integralmente a variabilidade real do consumo residencial. Além disso, o modelo </w:t>
-      </w:r>
-      <w:proofErr w:type="spellStart"/>
-      <w:r>
-        <w:rPr>
-          <w:color w:val="000000"/>
-          <w:lang w:val="pt-BR"/>
-        </w:rPr>
-        <w:t>MLBatLife</w:t>
-      </w:r>
-      <w:proofErr w:type="spellEnd"/>
-      <w:r>
-        <w:rPr>
-          <w:color w:val="000000"/>
-          <w:lang w:val="pt-BR"/>
-        </w:rPr>
-        <w:t xml:space="preserve"> considera apenas a estratégia </w:t>
-      </w:r>
-      <w:proofErr w:type="spellStart"/>
-      <w:r>
-        <w:rPr>
-          <w:color w:val="000000"/>
-          <w:lang w:val="pt-BR"/>
-        </w:rPr>
-        <w:t>Greedy</w:t>
-      </w:r>
-      <w:proofErr w:type="spellEnd"/>
-      <w:r>
-        <w:rPr>
-          <w:color w:val="000000"/>
-          <w:lang w:val="pt-BR"/>
-        </w:rPr>
-        <w:t xml:space="preserve"> de operação, não contemplando estratégias otimizadas de carga e descarga que poderiam prolongar a vida útil da bateria. A validação com dados de campo de sistemas brasileiros é recomendada para futuros trabalhos (AITIO; HOWEY, 2021; PEDREGOSA et al., 2011).</w:t>
+        <w:t>Como limitação, destaca-se que o perfil brasileiro foi construído a partir de dados sintéticos, combinando a curva de carga PROCEL com geração estimada pelo PVGIS, o que pode não representar integralmente a variabilidade real do consumo residencial. Além disso, o modelo MLBatLife considera apenas a estratégia Greedy de operação, não contemplando estratégias otimizadas de carga e descarga que poderiam prolongar a vida útil da bateria. A validação com dados de campo de sistemas brasileiros é recomendada para futuros trabalhos (AITIO; HOWEY, 2021; PEDREGOSA et al., 2011).</w:t>
       </w:r>
     </w:p>
     <w:p>
@@ -3476,21 +2910,7 @@
         <w:rPr>
           <w:lang w:val="pt-BR"/>
         </w:rPr>
-        <w:t xml:space="preserve">. Agência Nacional de Energia Elétrica. Resolução Normativa nº 927, de 14 de dezembro de 2021. Estabelece regras para o </w:t>
-      </w:r>
-      <w:proofErr w:type="spellStart"/>
-      <w:r>
-        <w:rPr>
-          <w:lang w:val="pt-BR"/>
-        </w:rPr>
-        <w:t>constrained</w:t>
-      </w:r>
-      <w:proofErr w:type="spellEnd"/>
-      <w:r>
-        <w:rPr>
-          <w:lang w:val="pt-BR"/>
-        </w:rPr>
-        <w:t>-off de centrais geradoras. Diário Oficial da União, Brasília, 2021.</w:t>
+        <w:t>. Agência Nacional de Energia Elétrica. Resolução Normativa nº 927, de 14 de dezembro de 2021. Estabelece regras para o constrained-off de centrais geradoras. Diário Oficial da União, Brasília, 2021.</w:t>
       </w:r>
     </w:p>
     <w:p>
@@ -3526,7 +2946,6 @@
         <w:rPr>
           <w:lang w:val="pt-BR"/>
         </w:rPr>
-        <w:lastRenderedPageBreak/>
         <w:t xml:space="preserve">EMPRESA DE PESQUISA ENERGÉTICA. Anuário estatístico de energia elétrica 2023: ano base 2022. </w:t>
       </w:r>
       <w:r>
@@ -3556,35 +2975,14 @@
       <w:r>
         <w:t xml:space="preserve">OPEN POWER SYSTEM DATA. Data package household data. </w:t>
       </w:r>
-      <w:proofErr w:type="spellStart"/>
-      <w:r>
-        <w:rPr>
-          <w:lang w:val="pt-BR"/>
-        </w:rPr>
-        <w:t>Version</w:t>
-      </w:r>
-      <w:proofErr w:type="spellEnd"/>
-      <w:r>
-        <w:rPr>
-          <w:lang w:val="pt-BR"/>
-        </w:rPr>
-        <w:t xml:space="preserve"> 2020-04-15. Disponível em: https://data.open-power-system-data.org/household_data/2020-04-15/. </w:t>
-      </w:r>
-      <w:proofErr w:type="spellStart"/>
-      <w:r>
-        <w:t>Acesso</w:t>
-      </w:r>
-      <w:proofErr w:type="spellEnd"/>
-      <w:r>
-        <w:t xml:space="preserve"> </w:t>
-      </w:r>
-      <w:proofErr w:type="spellStart"/>
-      <w:r>
-        <w:t>em</w:t>
-      </w:r>
-      <w:proofErr w:type="spellEnd"/>
-      <w:r>
-        <w:t>: jun. 2025.</w:t>
+      <w:r>
+        <w:rPr>
+          <w:lang w:val="pt-BR"/>
+        </w:rPr>
+        <w:t xml:space="preserve">Version 2020-04-15. Disponível em: https://data.open-power-system-data.org/household_data/2020-04-15/. </w:t>
+      </w:r>
+      <w:r>
+        <w:t>Acesso em: jun. 2025.</w:t>
       </w:r>
     </w:p>
     <w:p>
@@ -3592,6 +2990,7 @@
         <w:pStyle w:val="ReferenciaTCC"/>
       </w:pPr>
       <w:r>
+        <w:lastRenderedPageBreak/>
         <w:t>PEDREGOSA, Fabian et al. Scikit-learn: machine learning in Python. Journal of Machine Learning Research, v. 12, p. 2825-2830, 2011.</w:t>
       </w:r>
     </w:p>
@@ -3623,15 +3022,7 @@
         <w:t xml:space="preserve">PROCEL/ELETROBRAS. Pesquisa de posse e hábitos de uso de equipamentos elétricos na classe residencial: relatório Brasil 2019. </w:t>
       </w:r>
       <w:r>
-        <w:t xml:space="preserve">Rio de Janeiro: </w:t>
-      </w:r>
-      <w:proofErr w:type="spellStart"/>
-      <w:r>
-        <w:t>Eletrobras</w:t>
-      </w:r>
-      <w:proofErr w:type="spellEnd"/>
-      <w:r>
-        <w:t>, 2019.</w:t>
+        <w:t>Rio de Janeiro: Eletrobras, 2019.</w:t>
       </w:r>
     </w:p>
     <w:p>
@@ -3658,111 +3049,22 @@
         </w:rPr>
       </w:pPr>
       <w:r>
-        <w:t xml:space="preserve">SILVA, Ricardo Emanuel Gomes Fernandes da. Artificial intelligence techniques applied for the predictive control of stationary storage. </w:t>
-      </w:r>
-      <w:r>
-        <w:rPr>
-          <w:lang w:val="pt-BR"/>
-        </w:rPr>
-        <w:t xml:space="preserve">2018. Dissertação (Mestrado Integrado em Engenharia Eletrotécnica e de Computadores) - </w:t>
-      </w:r>
-      <w:proofErr w:type="spellStart"/>
-      <w:r>
-        <w:rPr>
-          <w:lang w:val="pt-BR"/>
-        </w:rPr>
-        <w:t>Faculty</w:t>
-      </w:r>
-      <w:proofErr w:type="spellEnd"/>
-      <w:r>
-        <w:rPr>
-          <w:lang w:val="pt-BR"/>
-        </w:rPr>
-        <w:t xml:space="preserve"> </w:t>
-      </w:r>
-      <w:proofErr w:type="spellStart"/>
-      <w:r>
-        <w:rPr>
-          <w:lang w:val="pt-BR"/>
-        </w:rPr>
-        <w:t>of</w:t>
-      </w:r>
-      <w:proofErr w:type="spellEnd"/>
-      <w:r>
-        <w:rPr>
-          <w:lang w:val="pt-BR"/>
-        </w:rPr>
-        <w:t xml:space="preserve"> </w:t>
-      </w:r>
-      <w:proofErr w:type="spellStart"/>
-      <w:r>
-        <w:rPr>
-          <w:lang w:val="pt-BR"/>
-        </w:rPr>
-        <w:t>Engineering</w:t>
-      </w:r>
-      <w:proofErr w:type="spellEnd"/>
-      <w:r>
-        <w:rPr>
-          <w:lang w:val="pt-BR"/>
-        </w:rPr>
-        <w:t xml:space="preserve"> </w:t>
-      </w:r>
-      <w:proofErr w:type="spellStart"/>
-      <w:r>
-        <w:rPr>
-          <w:lang w:val="pt-BR"/>
-        </w:rPr>
-        <w:t>of</w:t>
-      </w:r>
-      <w:proofErr w:type="spellEnd"/>
-      <w:r>
-        <w:rPr>
-          <w:lang w:val="pt-BR"/>
-        </w:rPr>
-        <w:t xml:space="preserve"> </w:t>
-      </w:r>
-      <w:proofErr w:type="spellStart"/>
-      <w:r>
-        <w:rPr>
-          <w:lang w:val="pt-BR"/>
-        </w:rPr>
-        <w:t>the</w:t>
-      </w:r>
-      <w:proofErr w:type="spellEnd"/>
-      <w:r>
-        <w:rPr>
-          <w:lang w:val="pt-BR"/>
-        </w:rPr>
-        <w:t xml:space="preserve"> </w:t>
-      </w:r>
-      <w:proofErr w:type="spellStart"/>
-      <w:r>
-        <w:rPr>
-          <w:lang w:val="pt-BR"/>
-        </w:rPr>
-        <w:t>University</w:t>
-      </w:r>
-      <w:proofErr w:type="spellEnd"/>
-      <w:r>
-        <w:rPr>
-          <w:lang w:val="pt-BR"/>
-        </w:rPr>
-        <w:t xml:space="preserve"> </w:t>
-      </w:r>
-      <w:proofErr w:type="spellStart"/>
-      <w:r>
-        <w:rPr>
-          <w:lang w:val="pt-BR"/>
-        </w:rPr>
-        <w:t>of</w:t>
-      </w:r>
-      <w:proofErr w:type="spellEnd"/>
-      <w:r>
-        <w:rPr>
-          <w:lang w:val="pt-BR"/>
-        </w:rPr>
-        <w:t xml:space="preserve"> Porto, Porto, 2018.</w:t>
+        <w:t xml:space="preserve">SILVA, Ricardo Emanuel Gomes Fernandes da. </w:t>
+      </w:r>
+      <w:r>
+        <w:t xml:space="preserve">Artificial intelligence techniques applied for the predictive control of stationary storage. </w:t>
+      </w:r>
+      <w:r>
+        <w:rPr>
+          <w:lang w:val="pt-BR"/>
+        </w:rPr>
+        <w:t xml:space="preserve">2018. </w:t>
+      </w:r>
+      <w:r>
+        <w:rPr>
+          <w:lang w:val="pt-BR"/>
+        </w:rPr>
+        <w:t>Dissertação (Mestrado Integrado em Engenharia Eletrotécnica e de Computadores) - Faculty of Engineering of the University of Porto, Porto, 2018.</w:t>
       </w:r>
     </w:p>
     <w:p>
@@ -3778,15 +3080,7 @@
         <w:pStyle w:val="ReferenciaTCC"/>
       </w:pPr>
       <w:r>
-        <w:t xml:space="preserve">BIRKL, Christoph R. et al. Degradation diagnostics for </w:t>
-      </w:r>
-      <w:proofErr w:type="gramStart"/>
-      <w:r>
-        <w:t>lithium ion</w:t>
-      </w:r>
-      <w:proofErr w:type="gramEnd"/>
-      <w:r>
-        <w:t xml:space="preserve"> cells. Journal of Power Sources, v. 341, p. 373-386, 2017.</w:t>
+        <w:t>BIRKL, Christoph R. et al. Degradation diagnostics for lithium ion cells. Journal of Power Sources, v. 341, p. 373-386, 2017.</w:t>
       </w:r>
     </w:p>
     <w:p>
@@ -3808,80 +3102,21 @@
     <w:p>
       <w:pPr>
         <w:pStyle w:val="ReferenciaTCC"/>
-        <w:rPr>
-          <w:lang w:val="pt-BR"/>
-        </w:rPr>
-      </w:pPr>
-      <w:r>
-        <w:t xml:space="preserve">XU, </w:t>
-      </w:r>
-      <w:proofErr w:type="spellStart"/>
-      <w:r>
-        <w:t>Bolun</w:t>
-      </w:r>
-      <w:proofErr w:type="spellEnd"/>
-      <w:r>
-        <w:t xml:space="preserve"> et al. Modeling of lithium-ion battery degradation for cell life assessment. </w:t>
-      </w:r>
-      <w:r>
-        <w:rPr>
-          <w:lang w:val="pt-BR"/>
-        </w:rPr>
-        <w:t xml:space="preserve">IEEE </w:t>
-      </w:r>
-      <w:proofErr w:type="spellStart"/>
-      <w:r>
-        <w:rPr>
-          <w:lang w:val="pt-BR"/>
-        </w:rPr>
-        <w:t>Transactions</w:t>
-      </w:r>
-      <w:proofErr w:type="spellEnd"/>
-      <w:r>
-        <w:rPr>
-          <w:lang w:val="pt-BR"/>
-        </w:rPr>
-        <w:t xml:space="preserve"> </w:t>
-      </w:r>
-      <w:proofErr w:type="spellStart"/>
-      <w:r>
-        <w:rPr>
-          <w:lang w:val="pt-BR"/>
-        </w:rPr>
-        <w:t>on</w:t>
-      </w:r>
-      <w:proofErr w:type="spellEnd"/>
-      <w:r>
-        <w:rPr>
-          <w:lang w:val="pt-BR"/>
-        </w:rPr>
-        <w:t xml:space="preserve"> </w:t>
-      </w:r>
-      <w:proofErr w:type="spellStart"/>
-      <w:r>
-        <w:rPr>
-          <w:lang w:val="pt-BR"/>
-        </w:rPr>
-        <w:t>Smart</w:t>
-      </w:r>
-      <w:proofErr w:type="spellEnd"/>
-      <w:r>
-        <w:rPr>
-          <w:lang w:val="pt-BR"/>
-        </w:rPr>
-        <w:t xml:space="preserve"> Grid, v. 9, n. 2, p. 1510-1519, 2018.</w:t>
+      </w:pPr>
+      <w:r>
+        <w:t xml:space="preserve">XU, Bolun et al. Modeling of lithium-ion battery degradation for cell life assessment. </w:t>
+      </w:r>
+      <w:r>
+        <w:t>IEEE Transactions on Smart Grid, v. 9, n. 2, p. 1510-1519, 2018.</w:t>
       </w:r>
     </w:p>
     <w:p>
       <w:pPr>
         <w:ind w:firstLine="0"/>
-        <w:rPr>
-          <w:lang w:val="pt-BR"/>
-        </w:rPr>
       </w:pPr>
     </w:p>
     <w:sectPr>
-      <w:headerReference w:type="default" r:id="rId11"/>
+      <w:headerReference w:type="default" r:id="rId13"/>
       <w:pgSz w:w="11906" w:h="16838"/>
       <w:pgMar w:top="1417" w:right="1417" w:bottom="1134" w:left="1417" w:header="709" w:footer="709" w:gutter="0"/>
       <w:cols w:space="720"/>
@@ -15570,6 +14805,7 @@
   </w:style>
   <w:style w:type="paragraph" w:customStyle="1" w:styleId="LegendaTCC">
     <w:name w:val="Legenda TCC"/>
+    <w:link w:val="LegendaTCCChar"/>
     <w:pPr>
       <w:spacing w:before="120" w:after="60" w:line="240" w:lineRule="auto"/>
       <w:jc w:val="center"/>
@@ -15795,6 +15031,39 @@
         </w:tcBorders>
       </w:tcPr>
     </w:tblStylePr>
+  </w:style>
+  <w:style w:type="paragraph" w:customStyle="1" w:styleId="TtulodeFiguras">
+    <w:name w:val="Título de Figuras"/>
+    <w:basedOn w:val="LegendaTCC"/>
+    <w:link w:val="TtulodeFigurasChar"/>
+    <w:qFormat/>
+    <w:rsid w:val="00663376"/>
+    <w:rPr>
+      <w:color w:val="000000"/>
+      <w:lang w:val="pt-BR"/>
+    </w:rPr>
+  </w:style>
+  <w:style w:type="character" w:customStyle="1" w:styleId="LegendaTCCChar">
+    <w:name w:val="Legenda TCC Char"/>
+    <w:basedOn w:val="Fontepargpadro"/>
+    <w:link w:val="LegendaTCC"/>
+    <w:rsid w:val="00663376"/>
+    <w:rPr>
+      <w:rFonts w:ascii="Arial" w:eastAsia="Arial" w:hAnsi="Arial"/>
+      <w:sz w:val="20"/>
+    </w:rPr>
+  </w:style>
+  <w:style w:type="character" w:customStyle="1" w:styleId="TtulodeFigurasChar">
+    <w:name w:val="Título de Figuras Char"/>
+    <w:basedOn w:val="LegendaTCCChar"/>
+    <w:link w:val="TtulodeFiguras"/>
+    <w:rsid w:val="00663376"/>
+    <w:rPr>
+      <w:rFonts w:ascii="Arial" w:eastAsia="Arial" w:hAnsi="Arial"/>
+      <w:color w:val="000000"/>
+      <w:sz w:val="20"/>
+      <w:lang w:val="pt-BR"/>
+    </w:rPr>
   </w:style>
 </w:styles>
 </file>

</xml_diff>